<commit_message>
Add 2026/27 catalog products (QOQI, Challpak, sesame butter, nut mixes, rings, basil qurt) and official SOLKERN logos
Co-Authored-By: Claude Fable 5.1 <noreply@anthropic.com>
Claude-Session: https://claude.ai/code/session_01XJmakD9AwxUpoXDNG4hanJ
</commit_message>
<xml_diff>
--- a/docs/SOLKERN_Image_Prompt_Book.docx
+++ b/docs/SOLKERN_Image_Prompt_Book.docx
@@ -1782,7 +1782,7 @@
                 <w:color w:val="111111"/>
                 <w:sz w:val="17"/>
               </w:rPr>
-              <w:t>PROD-TAHINI</w:t>
+              <w:t>PROD-JAM-TRIO</w:t>
             </w:r>
           </w:p>
         </w:tc>
@@ -1800,7 +1800,7 @@
                 <w:color w:val="111111"/>
                 <w:sz w:val="17"/>
               </w:rPr>
-              <w:t>ERMÁK 페이지 제품 '참깨 페이스트(타히니)'</w:t>
+              <w:t>ERMÁK 페이지 제품 '체리·살구·모과 잼'</w:t>
             </w:r>
           </w:p>
         </w:tc>
@@ -1836,155 +1836,7 @@
                 <w:color w:val="111111"/>
                 <w:sz w:val="17"/>
               </w:rPr>
-              <w:t>실제 제품 촬영 컷으로 교체 권장(카탈로그 p.10 참고).</w:t>
-            </w:r>
-          </w:p>
-        </w:tc>
-      </w:tr>
-      <w:tr>
-        <w:tc>
-          <w:tcPr>
-            <w:tcW w:type="dxa" w:w="1928"/>
-          </w:tcPr>
-          <w:p>
-            <w:r/>
-            <w:r>
-              <w:rPr>
-                <w:rFonts w:ascii="Pretendard" w:hAnsi="Pretendard" w:eastAsia="Pretendard"/>
-                <w:b/>
-                <w:i w:val="0"/>
-                <w:color w:val="111111"/>
-                <w:sz w:val="17"/>
-              </w:rPr>
-              <w:t>PROD-JAM-TRIO</w:t>
-            </w:r>
-          </w:p>
-        </w:tc>
-        <w:tc>
-          <w:tcPr>
-            <w:tcW w:type="dxa" w:w="3515"/>
-          </w:tcPr>
-          <w:p>
-            <w:r/>
-            <w:r>
-              <w:rPr>
-                <w:rFonts w:ascii="Pretendard" w:hAnsi="Pretendard" w:eastAsia="Pretendard"/>
-                <w:b w:val="0"/>
-                <w:i w:val="0"/>
-                <w:color w:val="111111"/>
-                <w:sz w:val="17"/>
-              </w:rPr>
-              <w:t>ERMÁK 페이지 제품 '체리·살구·모과 잼'</w:t>
-            </w:r>
-          </w:p>
-        </w:tc>
-        <w:tc>
-          <w:tcPr>
-            <w:tcW w:type="dxa" w:w="1247"/>
-          </w:tcPr>
-          <w:p>
-            <w:r/>
-            <w:r>
-              <w:rPr>
-                <w:rFonts w:ascii="Pretendard" w:hAnsi="Pretendard" w:eastAsia="Pretendard"/>
-                <w:b w:val="0"/>
-                <w:i w:val="0"/>
-                <w:color w:val="111111"/>
-                <w:sz w:val="17"/>
-              </w:rPr>
-              <w:t>1:1</w:t>
-            </w:r>
-          </w:p>
-        </w:tc>
-        <w:tc>
-          <w:tcPr>
-            <w:tcW w:type="dxa" w:w="2948"/>
-          </w:tcPr>
-          <w:p>
-            <w:r/>
-            <w:r>
-              <w:rPr>
-                <w:rFonts w:ascii="Pretendard" w:hAnsi="Pretendard" w:eastAsia="Pretendard"/>
-                <w:b w:val="0"/>
-                <w:i w:val="0"/>
-                <w:color w:val="111111"/>
-                <w:sz w:val="17"/>
-              </w:rPr>
               <w:t>실제 제품 컷 교체 권장(카탈로그 p.12).</w:t>
-            </w:r>
-          </w:p>
-        </w:tc>
-      </w:tr>
-      <w:tr>
-        <w:tc>
-          <w:tcPr>
-            <w:tcW w:type="dxa" w:w="1928"/>
-          </w:tcPr>
-          <w:p>
-            <w:r/>
-            <w:r>
-              <w:rPr>
-                <w:rFonts w:ascii="Pretendard" w:hAnsi="Pretendard" w:eastAsia="Pretendard"/>
-                <w:b/>
-                <w:i w:val="0"/>
-                <w:color w:val="111111"/>
-                <w:sz w:val="17"/>
-              </w:rPr>
-              <w:t>PROD-FRUITSNACK</w:t>
-            </w:r>
-          </w:p>
-        </w:tc>
-        <w:tc>
-          <w:tcPr>
-            <w:tcW w:type="dxa" w:w="3515"/>
-          </w:tcPr>
-          <w:p>
-            <w:r/>
-            <w:r>
-              <w:rPr>
-                <w:rFonts w:ascii="Pretendard" w:hAnsi="Pretendard" w:eastAsia="Pretendard"/>
-                <w:b w:val="0"/>
-                <w:i w:val="0"/>
-                <w:color w:val="111111"/>
-                <w:sz w:val="17"/>
-              </w:rPr>
-              <w:t>ERMÁK 페이지 제품 '과일 가공 스낵(QOQI·Challpak)'</w:t>
-            </w:r>
-          </w:p>
-        </w:tc>
-        <w:tc>
-          <w:tcPr>
-            <w:tcW w:type="dxa" w:w="1247"/>
-          </w:tcPr>
-          <w:p>
-            <w:r/>
-            <w:r>
-              <w:rPr>
-                <w:rFonts w:ascii="Pretendard" w:hAnsi="Pretendard" w:eastAsia="Pretendard"/>
-                <w:b w:val="0"/>
-                <w:i w:val="0"/>
-                <w:color w:val="111111"/>
-                <w:sz w:val="17"/>
-              </w:rPr>
-              <w:t>1:1</w:t>
-            </w:r>
-          </w:p>
-        </w:tc>
-        <w:tc>
-          <w:tcPr>
-            <w:tcW w:type="dxa" w:w="2948"/>
-          </w:tcPr>
-          <w:p>
-            <w:r/>
-            <w:r>
-              <w:rPr>
-                <w:rFonts w:ascii="Pretendard" w:hAnsi="Pretendard" w:eastAsia="Pretendard"/>
-                <w:b w:val="0"/>
-                <w:i w:val="0"/>
-                <w:color w:val="111111"/>
-                <w:sz w:val="17"/>
-              </w:rPr>
-              <w:t>실제 제품 컷 확보 전 임시.</w:t>
             </w:r>
           </w:p>
         </w:tc>
@@ -8450,313 +8302,6 @@
           <w:color w:val="111111"/>
           <w:sz w:val="28"/>
         </w:rPr>
-        <w:t>PROD-TAHINI</w:t>
-      </w:r>
-    </w:p>
-    <w:tbl>
-      <w:tblPr>
-        <w:tblStyle w:val="TableGrid"/>
-        <w:tblW w:type="auto" w:w="0"/>
-        <w:tblLook w:firstColumn="1" w:firstRow="1" w:lastColumn="0" w:lastRow="0" w:noHBand="0" w:noVBand="1" w:val="04A0"/>
-      </w:tblPr>
-      <w:tblGrid>
-        <w:gridCol w:w="4986"/>
-        <w:gridCol w:w="4986"/>
-      </w:tblGrid>
-      <w:tr>
-        <w:tc>
-          <w:tcPr>
-            <w:tcW w:type="dxa" w:w="1701"/>
-            <w:shd w:val="clear" w:color="auto" w:fill="F3EAD3"/>
-          </w:tcPr>
-          <w:p>
-            <w:r/>
-            <w:r>
-              <w:rPr>
-                <w:rFonts w:ascii="Pretendard" w:hAnsi="Pretendard" w:eastAsia="Pretendard"/>
-                <w:b/>
-                <w:i w:val="0"/>
-                <w:color w:val="111111"/>
-                <w:sz w:val="18"/>
-              </w:rPr>
-              <w:t>위치</w:t>
-            </w:r>
-          </w:p>
-        </w:tc>
-        <w:tc>
-          <w:tcPr>
-            <w:tcW w:type="dxa" w:w="7937"/>
-          </w:tcPr>
-          <w:p>
-            <w:r/>
-            <w:r>
-              <w:rPr>
-                <w:rFonts w:ascii="Pretendard" w:hAnsi="Pretendard" w:eastAsia="Pretendard"/>
-                <w:b w:val="0"/>
-                <w:i w:val="0"/>
-                <w:color w:val="111111"/>
-                <w:sz w:val="18"/>
-              </w:rPr>
-              <w:t>ERMÁK 페이지 제품 '참깨 페이스트(타히니)'</w:t>
-            </w:r>
-          </w:p>
-        </w:tc>
-      </w:tr>
-      <w:tr>
-        <w:tc>
-          <w:tcPr>
-            <w:tcW w:type="dxa" w:w="1701"/>
-            <w:shd w:val="clear" w:color="auto" w:fill="F3EAD3"/>
-          </w:tcPr>
-          <w:p>
-            <w:r/>
-            <w:r>
-              <w:rPr>
-                <w:rFonts w:ascii="Pretendard" w:hAnsi="Pretendard" w:eastAsia="Pretendard"/>
-                <w:b/>
-                <w:i w:val="0"/>
-                <w:color w:val="111111"/>
-                <w:sz w:val="18"/>
-              </w:rPr>
-              <w:t>비율</w:t>
-            </w:r>
-          </w:p>
-        </w:tc>
-        <w:tc>
-          <w:tcPr>
-            <w:tcW w:type="dxa" w:w="7937"/>
-          </w:tcPr>
-          <w:p>
-            <w:r/>
-            <w:r>
-              <w:rPr>
-                <w:rFonts w:ascii="Pretendard" w:hAnsi="Pretendard" w:eastAsia="Pretendard"/>
-                <w:b w:val="0"/>
-                <w:i w:val="0"/>
-                <w:color w:val="111111"/>
-                <w:sz w:val="18"/>
-              </w:rPr>
-              <w:t>1:1</w:t>
-            </w:r>
-          </w:p>
-        </w:tc>
-      </w:tr>
-      <w:tr>
-        <w:tc>
-          <w:tcPr>
-            <w:tcW w:type="dxa" w:w="1701"/>
-            <w:shd w:val="clear" w:color="auto" w:fill="F3EAD3"/>
-          </w:tcPr>
-          <w:p>
-            <w:r/>
-            <w:r>
-              <w:rPr>
-                <w:rFonts w:ascii="Pretendard" w:hAnsi="Pretendard" w:eastAsia="Pretendard"/>
-                <w:b/>
-                <w:i w:val="0"/>
-                <w:color w:val="111111"/>
-                <w:sz w:val="18"/>
-              </w:rPr>
-              <w:t>역할·무드</w:t>
-            </w:r>
-          </w:p>
-        </w:tc>
-        <w:tc>
-          <w:tcPr>
-            <w:tcW w:type="dxa" w:w="7937"/>
-          </w:tcPr>
-          <w:p>
-            <w:r/>
-            <w:r>
-              <w:rPr>
-                <w:rFonts w:ascii="Pretendard" w:hAnsi="Pretendard" w:eastAsia="Pretendard"/>
-                <w:b w:val="0"/>
-                <w:i w:val="0"/>
-                <w:color w:val="111111"/>
-                <w:sz w:val="18"/>
-              </w:rPr>
-              <w:t>실제 제품 촬영 컷으로 교체 권장(카탈로그 p.10 참고).</w:t>
-            </w:r>
-          </w:p>
-        </w:tc>
-      </w:tr>
-      <w:tr>
-        <w:tc>
-          <w:tcPr>
-            <w:tcW w:type="dxa" w:w="1701"/>
-            <w:shd w:val="clear" w:color="auto" w:fill="F3EAD3"/>
-          </w:tcPr>
-          <w:p>
-            <w:r/>
-            <w:r>
-              <w:rPr>
-                <w:rFonts w:ascii="Pretendard" w:hAnsi="Pretendard" w:eastAsia="Pretendard"/>
-                <w:b/>
-                <w:i w:val="0"/>
-                <w:color w:val="111111"/>
-                <w:sz w:val="18"/>
-              </w:rPr>
-              <w:t>영문 프롬프트</w:t>
-            </w:r>
-          </w:p>
-        </w:tc>
-        <w:tc>
-          <w:tcPr>
-            <w:tcW w:type="dxa" w:w="7937"/>
-          </w:tcPr>
-          <w:p>
-            <w:r/>
-            <w:r>
-              <w:rPr>
-                <w:rFonts w:ascii="Pretendard" w:hAnsi="Pretendard" w:eastAsia="Pretendard"/>
-                <w:b w:val="0"/>
-                <w:i w:val="0"/>
-                <w:color w:val="111111"/>
-                <w:sz w:val="18"/>
-              </w:rPr>
-              <w:t>Studio product shot of a glass jar of smooth beige sesame tahini with a black lid, sesame seeds scattered, pure white background, isolated cut-out style matching a premium food catalog, editorial food &amp; origin photography, photorealistic, natural warm light, muted palette of ivory, soil brown, pomegranate burgundy, apricot orange and leaf green with subtle gold accents, shallow depth of field, 35mm lens, premium brand-site quality, no text, no logos, no watermark</w:t>
-            </w:r>
-          </w:p>
-        </w:tc>
-      </w:tr>
-      <w:tr>
-        <w:tc>
-          <w:tcPr>
-            <w:tcW w:type="dxa" w:w="1701"/>
-            <w:shd w:val="clear" w:color="auto" w:fill="F3EAD3"/>
-          </w:tcPr>
-          <w:p>
-            <w:r/>
-            <w:r>
-              <w:rPr>
-                <w:rFonts w:ascii="Pretendard" w:hAnsi="Pretendard" w:eastAsia="Pretendard"/>
-                <w:b/>
-                <w:i w:val="0"/>
-                <w:color w:val="111111"/>
-                <w:sz w:val="18"/>
-              </w:rPr>
-              <w:t>한글 프롬프트</w:t>
-            </w:r>
-          </w:p>
-        </w:tc>
-        <w:tc>
-          <w:tcPr>
-            <w:tcW w:type="dxa" w:w="7937"/>
-          </w:tcPr>
-          <w:p>
-            <w:r/>
-            <w:r>
-              <w:rPr>
-                <w:rFonts w:ascii="Pretendard" w:hAnsi="Pretendard" w:eastAsia="Pretendard"/>
-                <w:b w:val="0"/>
-                <w:i w:val="0"/>
-                <w:color w:val="111111"/>
-                <w:sz w:val="18"/>
-              </w:rPr>
-              <w:t>검은 뚜껑의 유리병에 담긴 부드러운 베이지색 참깨 타히니, 흩어진 참깨, 순백 배경, 프리미엄 식품 카탈로그 스타일 누끼 컷. 에디토리얼 푸드·원산지 사진, 실사, 자연스러운 따뜻한 빛, 아이보리·소일브라운·석류 버건디·살구 오렌지·리프 그린의 저채도 팔레트에 은은한 골드 포인트, 얕은 심도, 35mm, 프리미엄 브랜드 사이트 품질, 글자·로고 없음</w:t>
-            </w:r>
-          </w:p>
-        </w:tc>
-      </w:tr>
-      <w:tr>
-        <w:tc>
-          <w:tcPr>
-            <w:tcW w:type="dxa" w:w="1701"/>
-            <w:shd w:val="clear" w:color="auto" w:fill="F3EAD3"/>
-          </w:tcPr>
-          <w:p>
-            <w:r/>
-            <w:r>
-              <w:rPr>
-                <w:rFonts w:ascii="Pretendard" w:hAnsi="Pretendard" w:eastAsia="Pretendard"/>
-                <w:b/>
-                <w:i w:val="0"/>
-                <w:color w:val="111111"/>
-                <w:sz w:val="18"/>
-              </w:rPr>
-              <w:t>Midjourney</w:t>
-            </w:r>
-          </w:p>
-        </w:tc>
-        <w:tc>
-          <w:tcPr>
-            <w:tcW w:type="dxa" w:w="7937"/>
-          </w:tcPr>
-          <w:p>
-            <w:r/>
-            <w:r>
-              <w:rPr>
-                <w:rFonts w:ascii="Pretendard" w:hAnsi="Pretendard" w:eastAsia="Pretendard"/>
-                <w:b w:val="0"/>
-                <w:i w:val="0"/>
-                <w:color w:val="111111"/>
-                <w:sz w:val="18"/>
-              </w:rPr>
-              <w:t>/imagine Studio product shot of a glass jar of smooth beige sesame tahini with a black lid, sesame seeds scattered, pure white background, isolated cut-out style matching a premium food catalog, editorial food &amp; origin photography, photorealistic, natural warm light, muted palette of ivory, soil brown, pomegranate burgundy, apricot orange and leaf green with subtle gold accents, shallow depth of field, 35mm lens, premium brand-site quality, no text, no logos, no watermark --ar 1:1 --style raw --v 7 --no text letters logo watermark cartoon illustration oversaturated HDR plastic look extra fingers deformed fruit cluttered background</w:t>
-            </w:r>
-          </w:p>
-        </w:tc>
-      </w:tr>
-      <w:tr>
-        <w:tc>
-          <w:tcPr>
-            <w:tcW w:type="dxa" w:w="1701"/>
-            <w:shd w:val="clear" w:color="auto" w:fill="F3EAD3"/>
-          </w:tcPr>
-          <w:p>
-            <w:r/>
-            <w:r>
-              <w:rPr>
-                <w:rFonts w:ascii="Pretendard" w:hAnsi="Pretendard" w:eastAsia="Pretendard"/>
-                <w:b/>
-                <w:i w:val="0"/>
-                <w:color w:val="111111"/>
-                <w:sz w:val="18"/>
-              </w:rPr>
-              <w:t>네거티브</w:t>
-            </w:r>
-          </w:p>
-        </w:tc>
-        <w:tc>
-          <w:tcPr>
-            <w:tcW w:type="dxa" w:w="7937"/>
-          </w:tcPr>
-          <w:p>
-            <w:r/>
-            <w:r>
-              <w:rPr>
-                <w:rFonts w:ascii="Pretendard" w:hAnsi="Pretendard" w:eastAsia="Pretendard"/>
-                <w:b w:val="0"/>
-                <w:i w:val="0"/>
-                <w:color w:val="111111"/>
-                <w:sz w:val="18"/>
-              </w:rPr>
-              <w:t>text, letters, logo, watermark, cartoon, illustration, oversaturated, HDR, plastic look, extra fingers, deformed fruit, cluttered background</w:t>
-            </w:r>
-          </w:p>
-        </w:tc>
-      </w:tr>
-    </w:tbl>
-    <w:p/>
-    <w:p>
-      <w:r>
-        <w:rPr>
-          <w:rFonts w:ascii="Pretendard" w:hAnsi="Pretendard" w:eastAsia="Pretendard"/>
-          <w:b/>
-          <w:i w:val="0"/>
-          <w:color w:val="B49141"/>
-          <w:sz w:val="28"/>
-        </w:rPr>
-        <w:t xml:space="preserve">22  </w:t>
-      </w:r>
-      <w:r>
-        <w:rPr>
-          <w:rFonts w:ascii="Pretendard" w:hAnsi="Pretendard" w:eastAsia="Pretendard"/>
-          <w:b/>
-          <w:i w:val="0"/>
-          <w:color w:val="111111"/>
-          <w:sz w:val="28"/>
-        </w:rPr>
         <w:t>PROD-JAM-TRIO</w:t>
       </w:r>
     </w:p>
@@ -9054,314 +8599,7 @@
           <w:color w:val="B49141"/>
           <w:sz w:val="28"/>
         </w:rPr>
-        <w:t xml:space="preserve">23  </w:t>
-      </w:r>
-      <w:r>
-        <w:rPr>
-          <w:rFonts w:ascii="Pretendard" w:hAnsi="Pretendard" w:eastAsia="Pretendard"/>
-          <w:b/>
-          <w:i w:val="0"/>
-          <w:color w:val="111111"/>
-          <w:sz w:val="28"/>
-        </w:rPr>
-        <w:t>PROD-FRUITSNACK</w:t>
-      </w:r>
-    </w:p>
-    <w:tbl>
-      <w:tblPr>
-        <w:tblStyle w:val="TableGrid"/>
-        <w:tblW w:type="auto" w:w="0"/>
-        <w:tblLook w:firstColumn="1" w:firstRow="1" w:lastColumn="0" w:lastRow="0" w:noHBand="0" w:noVBand="1" w:val="04A0"/>
-      </w:tblPr>
-      <w:tblGrid>
-        <w:gridCol w:w="4986"/>
-        <w:gridCol w:w="4986"/>
-      </w:tblGrid>
-      <w:tr>
-        <w:tc>
-          <w:tcPr>
-            <w:tcW w:type="dxa" w:w="1701"/>
-            <w:shd w:val="clear" w:color="auto" w:fill="F3EAD3"/>
-          </w:tcPr>
-          <w:p>
-            <w:r/>
-            <w:r>
-              <w:rPr>
-                <w:rFonts w:ascii="Pretendard" w:hAnsi="Pretendard" w:eastAsia="Pretendard"/>
-                <w:b/>
-                <w:i w:val="0"/>
-                <w:color w:val="111111"/>
-                <w:sz w:val="18"/>
-              </w:rPr>
-              <w:t>위치</w:t>
-            </w:r>
-          </w:p>
-        </w:tc>
-        <w:tc>
-          <w:tcPr>
-            <w:tcW w:type="dxa" w:w="7937"/>
-          </w:tcPr>
-          <w:p>
-            <w:r/>
-            <w:r>
-              <w:rPr>
-                <w:rFonts w:ascii="Pretendard" w:hAnsi="Pretendard" w:eastAsia="Pretendard"/>
-                <w:b w:val="0"/>
-                <w:i w:val="0"/>
-                <w:color w:val="111111"/>
-                <w:sz w:val="18"/>
-              </w:rPr>
-              <w:t>ERMÁK 페이지 제품 '과일 가공 스낵(QOQI·Challpak)'</w:t>
-            </w:r>
-          </w:p>
-        </w:tc>
-      </w:tr>
-      <w:tr>
-        <w:tc>
-          <w:tcPr>
-            <w:tcW w:type="dxa" w:w="1701"/>
-            <w:shd w:val="clear" w:color="auto" w:fill="F3EAD3"/>
-          </w:tcPr>
-          <w:p>
-            <w:r/>
-            <w:r>
-              <w:rPr>
-                <w:rFonts w:ascii="Pretendard" w:hAnsi="Pretendard" w:eastAsia="Pretendard"/>
-                <w:b/>
-                <w:i w:val="0"/>
-                <w:color w:val="111111"/>
-                <w:sz w:val="18"/>
-              </w:rPr>
-              <w:t>비율</w:t>
-            </w:r>
-          </w:p>
-        </w:tc>
-        <w:tc>
-          <w:tcPr>
-            <w:tcW w:type="dxa" w:w="7937"/>
-          </w:tcPr>
-          <w:p>
-            <w:r/>
-            <w:r>
-              <w:rPr>
-                <w:rFonts w:ascii="Pretendard" w:hAnsi="Pretendard" w:eastAsia="Pretendard"/>
-                <w:b w:val="0"/>
-                <w:i w:val="0"/>
-                <w:color w:val="111111"/>
-                <w:sz w:val="18"/>
-              </w:rPr>
-              <w:t>1:1</w:t>
-            </w:r>
-          </w:p>
-        </w:tc>
-      </w:tr>
-      <w:tr>
-        <w:tc>
-          <w:tcPr>
-            <w:tcW w:type="dxa" w:w="1701"/>
-            <w:shd w:val="clear" w:color="auto" w:fill="F3EAD3"/>
-          </w:tcPr>
-          <w:p>
-            <w:r/>
-            <w:r>
-              <w:rPr>
-                <w:rFonts w:ascii="Pretendard" w:hAnsi="Pretendard" w:eastAsia="Pretendard"/>
-                <w:b/>
-                <w:i w:val="0"/>
-                <w:color w:val="111111"/>
-                <w:sz w:val="18"/>
-              </w:rPr>
-              <w:t>역할·무드</w:t>
-            </w:r>
-          </w:p>
-        </w:tc>
-        <w:tc>
-          <w:tcPr>
-            <w:tcW w:type="dxa" w:w="7937"/>
-          </w:tcPr>
-          <w:p>
-            <w:r/>
-            <w:r>
-              <w:rPr>
-                <w:rFonts w:ascii="Pretendard" w:hAnsi="Pretendard" w:eastAsia="Pretendard"/>
-                <w:b w:val="0"/>
-                <w:i w:val="0"/>
-                <w:color w:val="111111"/>
-                <w:sz w:val="18"/>
-              </w:rPr>
-              <w:t>실제 제품 컷 확보 전 임시.</w:t>
-            </w:r>
-          </w:p>
-        </w:tc>
-      </w:tr>
-      <w:tr>
-        <w:tc>
-          <w:tcPr>
-            <w:tcW w:type="dxa" w:w="1701"/>
-            <w:shd w:val="clear" w:color="auto" w:fill="F3EAD3"/>
-          </w:tcPr>
-          <w:p>
-            <w:r/>
-            <w:r>
-              <w:rPr>
-                <w:rFonts w:ascii="Pretendard" w:hAnsi="Pretendard" w:eastAsia="Pretendard"/>
-                <w:b/>
-                <w:i w:val="0"/>
-                <w:color w:val="111111"/>
-                <w:sz w:val="18"/>
-              </w:rPr>
-              <w:t>영문 프롬프트</w:t>
-            </w:r>
-          </w:p>
-        </w:tc>
-        <w:tc>
-          <w:tcPr>
-            <w:tcW w:type="dxa" w:w="7937"/>
-          </w:tcPr>
-          <w:p>
-            <w:r/>
-            <w:r>
-              <w:rPr>
-                <w:rFonts w:ascii="Pretendard" w:hAnsi="Pretendard" w:eastAsia="Pretendard"/>
-                <w:b w:val="0"/>
-                <w:i w:val="0"/>
-                <w:color w:val="111111"/>
-                <w:sz w:val="18"/>
-              </w:rPr>
-              <w:t>Studio shot of dried apricot and persimmon fruit snack pieces in a small kraft pouch with a blank label, a few pieces scattered in front, pure white background, isolated cut-out style, editorial food &amp; origin photography, photorealistic, natural warm light, muted palette of ivory, soil brown, pomegranate burgundy, apricot orange and leaf green with subtle gold accents, shallow depth of field, 35mm lens, premium brand-site quality, no text, no logos, no watermark</w:t>
-            </w:r>
-          </w:p>
-        </w:tc>
-      </w:tr>
-      <w:tr>
-        <w:tc>
-          <w:tcPr>
-            <w:tcW w:type="dxa" w:w="1701"/>
-            <w:shd w:val="clear" w:color="auto" w:fill="F3EAD3"/>
-          </w:tcPr>
-          <w:p>
-            <w:r/>
-            <w:r>
-              <w:rPr>
-                <w:rFonts w:ascii="Pretendard" w:hAnsi="Pretendard" w:eastAsia="Pretendard"/>
-                <w:b/>
-                <w:i w:val="0"/>
-                <w:color w:val="111111"/>
-                <w:sz w:val="18"/>
-              </w:rPr>
-              <w:t>한글 프롬프트</w:t>
-            </w:r>
-          </w:p>
-        </w:tc>
-        <w:tc>
-          <w:tcPr>
-            <w:tcW w:type="dxa" w:w="7937"/>
-          </w:tcPr>
-          <w:p>
-            <w:r/>
-            <w:r>
-              <w:rPr>
-                <w:rFonts w:ascii="Pretendard" w:hAnsi="Pretendard" w:eastAsia="Pretendard"/>
-                <w:b w:val="0"/>
-                <w:i w:val="0"/>
-                <w:color w:val="111111"/>
-                <w:sz w:val="18"/>
-              </w:rPr>
-              <w:t>빈 라벨의 작은 크라프트 파우치에 담긴 건살구·건감 과일 스낵 조각, 앞에 몇 조각 흩어짐, 순백 배경, 누끼 스타일. 에디토리얼 푸드·원산지 사진, 실사, 자연스러운 따뜻한 빛, 아이보리·소일브라운·석류 버건디·살구 오렌지·리프 그린의 저채도 팔레트에 은은한 골드 포인트, 얕은 심도, 35mm, 프리미엄 브랜드 사이트 품질, 글자·로고 없음</w:t>
-            </w:r>
-          </w:p>
-        </w:tc>
-      </w:tr>
-      <w:tr>
-        <w:tc>
-          <w:tcPr>
-            <w:tcW w:type="dxa" w:w="1701"/>
-            <w:shd w:val="clear" w:color="auto" w:fill="F3EAD3"/>
-          </w:tcPr>
-          <w:p>
-            <w:r/>
-            <w:r>
-              <w:rPr>
-                <w:rFonts w:ascii="Pretendard" w:hAnsi="Pretendard" w:eastAsia="Pretendard"/>
-                <w:b/>
-                <w:i w:val="0"/>
-                <w:color w:val="111111"/>
-                <w:sz w:val="18"/>
-              </w:rPr>
-              <w:t>Midjourney</w:t>
-            </w:r>
-          </w:p>
-        </w:tc>
-        <w:tc>
-          <w:tcPr>
-            <w:tcW w:type="dxa" w:w="7937"/>
-          </w:tcPr>
-          <w:p>
-            <w:r/>
-            <w:r>
-              <w:rPr>
-                <w:rFonts w:ascii="Pretendard" w:hAnsi="Pretendard" w:eastAsia="Pretendard"/>
-                <w:b w:val="0"/>
-                <w:i w:val="0"/>
-                <w:color w:val="111111"/>
-                <w:sz w:val="18"/>
-              </w:rPr>
-              <w:t>/imagine Studio shot of dried apricot and persimmon fruit snack pieces in a small kraft pouch with a blank label, a few pieces scattered in front, pure white background, isolated cut-out style, editorial food &amp; origin photography, photorealistic, natural warm light, muted palette of ivory, soil brown, pomegranate burgundy, apricot orange and leaf green with subtle gold accents, shallow depth of field, 35mm lens, premium brand-site quality, no text, no logos, no watermark --ar 1:1 --style raw --v 7 --no text letters logo watermark cartoon illustration oversaturated HDR plastic look extra fingers deformed fruit cluttered background</w:t>
-            </w:r>
-          </w:p>
-        </w:tc>
-      </w:tr>
-      <w:tr>
-        <w:tc>
-          <w:tcPr>
-            <w:tcW w:type="dxa" w:w="1701"/>
-            <w:shd w:val="clear" w:color="auto" w:fill="F3EAD3"/>
-          </w:tcPr>
-          <w:p>
-            <w:r/>
-            <w:r>
-              <w:rPr>
-                <w:rFonts w:ascii="Pretendard" w:hAnsi="Pretendard" w:eastAsia="Pretendard"/>
-                <w:b/>
-                <w:i w:val="0"/>
-                <w:color w:val="111111"/>
-                <w:sz w:val="18"/>
-              </w:rPr>
-              <w:t>네거티브</w:t>
-            </w:r>
-          </w:p>
-        </w:tc>
-        <w:tc>
-          <w:tcPr>
-            <w:tcW w:type="dxa" w:w="7937"/>
-          </w:tcPr>
-          <w:p>
-            <w:r/>
-            <w:r>
-              <w:rPr>
-                <w:rFonts w:ascii="Pretendard" w:hAnsi="Pretendard" w:eastAsia="Pretendard"/>
-                <w:b w:val="0"/>
-                <w:i w:val="0"/>
-                <w:color w:val="111111"/>
-                <w:sz w:val="18"/>
-              </w:rPr>
-              <w:t>text, letters, logo, watermark, cartoon, illustration, oversaturated, HDR, plastic look, extra fingers, deformed fruit, cluttered background</w:t>
-            </w:r>
-          </w:p>
-        </w:tc>
-      </w:tr>
-    </w:tbl>
-    <w:p/>
-    <w:p>
-      <w:r>
-        <w:rPr>
-          <w:rFonts w:ascii="Pretendard" w:hAnsi="Pretendard" w:eastAsia="Pretendard"/>
-          <w:b/>
-          <w:i w:val="0"/>
-          <w:color w:val="B49141"/>
-          <w:sz w:val="28"/>
-        </w:rPr>
-        <w:t xml:space="preserve">24  </w:t>
+        <w:t xml:space="preserve">22  </w:t>
       </w:r>
       <w:r>
         <w:rPr>
@@ -9668,7 +8906,7 @@
           <w:color w:val="B49141"/>
           <w:sz w:val="28"/>
         </w:rPr>
-        <w:t xml:space="preserve">25  </w:t>
+        <w:t xml:space="preserve">23  </w:t>
       </w:r>
       <w:r>
         <w:rPr>
@@ -9975,7 +9213,7 @@
           <w:color w:val="B49141"/>
           <w:sz w:val="28"/>
         </w:rPr>
-        <w:t xml:space="preserve">26  </w:t>
+        <w:t xml:space="preserve">24  </w:t>
       </w:r>
       <w:r>
         <w:rPr>
@@ -10282,7 +9520,7 @@
           <w:color w:val="B49141"/>
           <w:sz w:val="28"/>
         </w:rPr>
-        <w:t xml:space="preserve">27  </w:t>
+        <w:t xml:space="preserve">25  </w:t>
       </w:r>
       <w:r>
         <w:rPr>

</xml_diff>

<commit_message>
ERMÁK employees 850+; image prompt book v2
Co-Authored-By: Claude Opus 5.5 <noreply@anthropic.com>
Claude-Session: https://claude.ai/code/session_01XJmakD9AwxUpoXDNG4hanJ
</commit_message>
<xml_diff>
--- a/docs/SOLKERN_Image_Prompt_Book.docx
+++ b/docs/SOLKERN_Image_Prompt_Book.docx
@@ -33,7 +33,7 @@
           <w:color w:val="555555"/>
           <w:sz w:val="18"/>
         </w:rPr>
-        <w:t>www.solkern.kr · 플레이스홀더(IMG · ID) 교체용 AI 이미지 프롬프트 · 2026.09</w:t>
+        <w:t>www.solkern.kr · 플레이스홀더(IMG · ID) 교체용 AI 이미지 프롬프트 · v2 (2026.09.30 홈페이지 최종 업데이트 반영)</w:t>
       </w:r>
     </w:p>
     <w:p/>
@@ -124,6 +124,51 @@
         <w:t>실제 사진(팀·오피스·공장)이 확보되면 AI 이미지보다 실제 사진을 우선합니다. 인물·브랜드 로고·문자 생성은 피하고, 라벨은 빈 라벨로 생성한 뒤 필요 시 후보정합니다.</w:t>
       </w:r>
     </w:p>
+    <w:p>
+      <w:pPr>
+        <w:pStyle w:val="ListBullet"/>
+      </w:pPr>
+      <w:r>
+        <w:rPr>
+          <w:rFonts w:ascii="Pretendard" w:hAnsi="Pretendard" w:eastAsia="Pretendard"/>
+          <w:b w:val="0"/>
+          <w:i w:val="0"/>
+          <w:color w:val="111111"/>
+          <w:sz w:val="19"/>
+        </w:rPr>
+        <w:t>사이트는 한국어·영어·일본어·중국어 4개 언어로 운영되며 모든 언어가 같은 이미지를 공유합니다. 이미지 안에 어떤 언어의 글자도 넣지 마세요(텍스트는 사이트가 언어별로 얹습니다).</w:t>
+      </w:r>
+    </w:p>
+    <w:p>
+      <w:pPr>
+        <w:pStyle w:val="ListBullet"/>
+      </w:pPr>
+      <w:r>
+        <w:rPr>
+          <w:rFonts w:ascii="Pretendard" w:hAnsi="Pretendard" w:eastAsia="Pretendard"/>
+          <w:b w:val="0"/>
+          <w:i w:val="0"/>
+          <w:color w:val="111111"/>
+          <w:sz w:val="19"/>
+        </w:rPr>
+        <w:t>ERMÁK 제품 카드(홈 COLLECTION · ERMÁK 페이지)는 모든 제품에 동일한 스포트라이트·후광·바닥 반사를 사이트가 자동으로 적용합니다. 제품·원물 이미지는 그림자·빛번짐·후광이 없는 완전 투명 배경으로 준비해야 효과가 균일하게 나옵니다(카탈로그 캡처처럼 뒤에 빛이 붙어 있으면 조명이 네모나게 잘려 보임).</w:t>
+      </w:r>
+    </w:p>
+    <w:p>
+      <w:pPr>
+        <w:pStyle w:val="ListBullet"/>
+      </w:pPr>
+      <w:r>
+        <w:rPr>
+          <w:rFonts w:ascii="Pretendard" w:hAnsi="Pretendard" w:eastAsia="Pretendard"/>
+          <w:b w:val="0"/>
+          <w:i w:val="0"/>
+          <w:color w:val="111111"/>
+          <w:sz w:val="19"/>
+        </w:rPr>
+        <w:t>실존 인물(ERMÁK 창립자·임직원) 이미지는 AI로 생성하지 않습니다. 권리자에게 실제 사진 원본을 받아 사용합니다(아래 "실사진 확보 권장 목록" 참고).</w:t>
+      </w:r>
+    </w:p>
     <w:p/>
     <w:p>
       <w:r>
@@ -184,6 +229,7 @@
         <w:t>이미지 비율 안내: 4:3 카드형 / 16:9·16:10·16:11 와이드 / 21:9 히어로 배경 / 1:1 원물·제품(누끼)</w:t>
       </w:r>
     </w:p>
+    <w:p/>
     <w:p>
       <w:r>
         <w:rPr>
@@ -193,7 +239,961 @@
           <w:color w:val="111111"/>
           <w:sz w:val="24"/>
         </w:rPr>
-        <w:t>플레이스홀더 목록</w:t>
+        <w:t>v2 업데이트 반영 사항 (2026.09.30 기준 홈페이지)</w:t>
+      </w:r>
+    </w:p>
+    <w:tbl>
+      <w:tblPr>
+        <w:tblStyle w:val="TableGrid"/>
+        <w:tblW w:type="auto" w:w="0"/>
+        <w:tblLook w:firstColumn="1" w:firstRow="1" w:lastColumn="0" w:lastRow="0" w:noHBand="0" w:noVBand="1" w:val="04A0"/>
+      </w:tblPr>
+      <w:tblGrid>
+        <w:gridCol w:w="3324"/>
+        <w:gridCol w:w="3324"/>
+        <w:gridCol w:w="3324"/>
+      </w:tblGrid>
+      <w:tr>
+        <w:tc>
+          <w:tcPr>
+            <w:tcW w:type="dxa" w:w="1361"/>
+            <w:shd w:val="clear" w:color="auto" w:fill="111111"/>
+          </w:tcPr>
+          <w:p>
+            <w:r/>
+            <w:r>
+              <w:rPr>
+                <w:rFonts w:ascii="Pretendard" w:hAnsi="Pretendard" w:eastAsia="Pretendard"/>
+                <w:b/>
+                <w:i w:val="0"/>
+                <w:color w:val="D4B46A"/>
+                <w:sz w:val="18"/>
+              </w:rPr>
+              <w:t>구분</w:t>
+            </w:r>
+          </w:p>
+        </w:tc>
+        <w:tc>
+          <w:tcPr>
+            <w:tcW w:type="dxa" w:w="4309"/>
+            <w:shd w:val="clear" w:color="auto" w:fill="111111"/>
+          </w:tcPr>
+          <w:p>
+            <w:r/>
+            <w:r>
+              <w:rPr>
+                <w:rFonts w:ascii="Pretendard" w:hAnsi="Pretendard" w:eastAsia="Pretendard"/>
+                <w:b/>
+                <w:i w:val="0"/>
+                <w:color w:val="D4B46A"/>
+                <w:sz w:val="18"/>
+              </w:rPr>
+              <w:t>홈페이지 변경</w:t>
+            </w:r>
+          </w:p>
+        </w:tc>
+        <w:tc>
+          <w:tcPr>
+            <w:tcW w:type="dxa" w:w="3969"/>
+            <w:shd w:val="clear" w:color="auto" w:fill="111111"/>
+          </w:tcPr>
+          <w:p>
+            <w:r/>
+            <w:r>
+              <w:rPr>
+                <w:rFonts w:ascii="Pretendard" w:hAnsi="Pretendard" w:eastAsia="Pretendard"/>
+                <w:b/>
+                <w:i w:val="0"/>
+                <w:color w:val="D4B46A"/>
+                <w:sz w:val="18"/>
+              </w:rPr>
+              <w:t>이미지 작업 영향</w:t>
+            </w:r>
+          </w:p>
+        </w:tc>
+      </w:tr>
+      <w:tr>
+        <w:tc>
+          <w:tcPr>
+            <w:tcW w:type="dxa" w:w="1361"/>
+          </w:tcPr>
+          <w:p>
+            <w:r/>
+            <w:r>
+              <w:rPr>
+                <w:rFonts w:ascii="Pretendard" w:hAnsi="Pretendard" w:eastAsia="Pretendard"/>
+                <w:b/>
+                <w:i w:val="0"/>
+                <w:color w:val="111111"/>
+                <w:sz w:val="17"/>
+              </w:rPr>
+              <w:t>다국어</w:t>
+            </w:r>
+          </w:p>
+        </w:tc>
+        <w:tc>
+          <w:tcPr>
+            <w:tcW w:type="dxa" w:w="4309"/>
+          </w:tcPr>
+          <w:p>
+            <w:r/>
+            <w:r>
+              <w:rPr>
+                <w:rFonts w:ascii="Pretendard" w:hAnsi="Pretendard" w:eastAsia="Pretendard"/>
+                <w:b w:val="0"/>
+                <w:i w:val="0"/>
+                <w:color w:val="111111"/>
+                <w:sz w:val="17"/>
+              </w:rPr>
+              <w:t>한국어·영어 → 한국어·영어·일본어·중국어(간체) 4개 언어</w:t>
+            </w:r>
+          </w:p>
+        </w:tc>
+        <w:tc>
+          <w:tcPr>
+            <w:tcW w:type="dxa" w:w="3969"/>
+          </w:tcPr>
+          <w:p>
+            <w:r/>
+            <w:r>
+              <w:rPr>
+                <w:rFonts w:ascii="Pretendard" w:hAnsi="Pretendard" w:eastAsia="Pretendard"/>
+                <w:b w:val="0"/>
+                <w:i w:val="0"/>
+                <w:color w:val="111111"/>
+                <w:sz w:val="17"/>
+              </w:rPr>
+              <w:t>이미지 내 텍스트 전면 금지(4개 언어 공용)</w:t>
+            </w:r>
+          </w:p>
+        </w:tc>
+      </w:tr>
+      <w:tr>
+        <w:tc>
+          <w:tcPr>
+            <w:tcW w:type="dxa" w:w="1361"/>
+          </w:tcPr>
+          <w:p>
+            <w:r/>
+            <w:r>
+              <w:rPr>
+                <w:rFonts w:ascii="Pretendard" w:hAnsi="Pretendard" w:eastAsia="Pretendard"/>
+                <w:b/>
+                <w:i w:val="0"/>
+                <w:color w:val="111111"/>
+                <w:sz w:val="17"/>
+              </w:rPr>
+              <w:t>포지셔닝</w:t>
+            </w:r>
+          </w:p>
+        </w:tc>
+        <w:tc>
+          <w:tcPr>
+            <w:tcW w:type="dxa" w:w="4309"/>
+          </w:tcPr>
+          <w:p>
+            <w:r/>
+            <w:r>
+              <w:rPr>
+                <w:rFonts w:ascii="Pretendard" w:hAnsi="Pretendard" w:eastAsia="Pretendard"/>
+                <w:b w:val="0"/>
+                <w:i w:val="0"/>
+                <w:color w:val="111111"/>
+                <w:sz w:val="17"/>
+              </w:rPr>
+              <w:t>'ERMÁK 공식 아시아 총판' → 'ERMÁK 아시아 공동진출 공식파트너'</w:t>
+            </w:r>
+          </w:p>
+        </w:tc>
+        <w:tc>
+          <w:tcPr>
+            <w:tcW w:type="dxa" w:w="3969"/>
+          </w:tcPr>
+          <w:p>
+            <w:r/>
+            <w:r>
+              <w:rPr>
+                <w:rFonts w:ascii="Pretendard" w:hAnsi="Pretendard" w:eastAsia="Pretendard"/>
+                <w:b w:val="0"/>
+                <w:i w:val="0"/>
+                <w:color w:val="111111"/>
+                <w:sz w:val="17"/>
+              </w:rPr>
+              <w:t>ABOUT-TEAM을 3사 협력·파트너십 무드로 재정의</w:t>
+            </w:r>
+          </w:p>
+        </w:tc>
+      </w:tr>
+      <w:tr>
+        <w:tc>
+          <w:tcPr>
+            <w:tcW w:type="dxa" w:w="1361"/>
+          </w:tcPr>
+          <w:p>
+            <w:r/>
+            <w:r>
+              <w:rPr>
+                <w:rFonts w:ascii="Pretendard" w:hAnsi="Pretendard" w:eastAsia="Pretendard"/>
+                <w:b/>
+                <w:i w:val="0"/>
+                <w:color w:val="111111"/>
+                <w:sz w:val="17"/>
+              </w:rPr>
+              <w:t>MARKET</w:t>
+            </w:r>
+          </w:p>
+        </w:tc>
+        <w:tc>
+          <w:tcPr>
+            <w:tcW w:type="dxa" w:w="4309"/>
+          </w:tcPr>
+          <w:p>
+            <w:r/>
+            <w:r>
+              <w:rPr>
+                <w:rFonts w:ascii="Pretendard" w:hAnsi="Pretendard" w:eastAsia="Pretendard"/>
+                <w:b w:val="0"/>
+                <w:i w:val="0"/>
+                <w:color w:val="111111"/>
+                <w:sz w:val="17"/>
+              </w:rPr>
+              <w:t>홈 08 MARKET에 아시아·태평양 12개국 인터랙티브 세계지도 구현</w:t>
+            </w:r>
+          </w:p>
+        </w:tc>
+        <w:tc>
+          <w:tcPr>
+            <w:tcW w:type="dxa" w:w="3969"/>
+          </w:tcPr>
+          <w:p>
+            <w:r/>
+            <w:r>
+              <w:rPr>
+                <w:rFonts w:ascii="Pretendard" w:hAnsi="Pretendard" w:eastAsia="Pretendard"/>
+                <w:b w:val="0"/>
+                <w:i w:val="0"/>
+                <w:color w:val="111111"/>
+                <w:sz w:val="17"/>
+              </w:rPr>
+              <w:t>MARKET-MAP은 JOURNEY 04 카드 전용 — 지도와 같은 색 체계(#111·골드·버건디)로 재작성</w:t>
+            </w:r>
+          </w:p>
+        </w:tc>
+      </w:tr>
+      <w:tr>
+        <w:tc>
+          <w:tcPr>
+            <w:tcW w:type="dxa" w:w="1361"/>
+          </w:tcPr>
+          <w:p>
+            <w:r/>
+            <w:r>
+              <w:rPr>
+                <w:rFonts w:ascii="Pretendard" w:hAnsi="Pretendard" w:eastAsia="Pretendard"/>
+                <w:b/>
+                <w:i w:val="0"/>
+                <w:color w:val="111111"/>
+                <w:sz w:val="17"/>
+              </w:rPr>
+              <w:t>제품 조명</w:t>
+            </w:r>
+          </w:p>
+        </w:tc>
+        <w:tc>
+          <w:tcPr>
+            <w:tcW w:type="dxa" w:w="4309"/>
+          </w:tcPr>
+          <w:p>
+            <w:r/>
+            <w:r>
+              <w:rPr>
+                <w:rFonts w:ascii="Pretendard" w:hAnsi="Pretendard" w:eastAsia="Pretendard"/>
+                <w:b w:val="0"/>
+                <w:i w:val="0"/>
+                <w:color w:val="111111"/>
+                <w:sz w:val="17"/>
+              </w:rPr>
+              <w:t>모든 제품 카드에 동일 스포트라이트·후광·바닥 반사 적용</w:t>
+            </w:r>
+          </w:p>
+        </w:tc>
+        <w:tc>
+          <w:tcPr>
+            <w:tcW w:type="dxa" w:w="3969"/>
+          </w:tcPr>
+          <w:p>
+            <w:r/>
+            <w:r>
+              <w:rPr>
+                <w:rFonts w:ascii="Pretendard" w:hAnsi="Pretendard" w:eastAsia="Pretendard"/>
+                <w:b w:val="0"/>
+                <w:i w:val="0"/>
+                <w:color w:val="111111"/>
+                <w:sz w:val="17"/>
+              </w:rPr>
+              <w:t>PROD-·FRUIT- 이미지는 그림자·후광 없는 완전 투명 누끼 필수</w:t>
+            </w:r>
+          </w:p>
+        </w:tc>
+      </w:tr>
+      <w:tr>
+        <w:tc>
+          <w:tcPr>
+            <w:tcW w:type="dxa" w:w="1361"/>
+          </w:tcPr>
+          <w:p>
+            <w:r/>
+            <w:r>
+              <w:rPr>
+                <w:rFonts w:ascii="Pretendard" w:hAnsi="Pretendard" w:eastAsia="Pretendard"/>
+                <w:b/>
+                <w:i w:val="0"/>
+                <w:color w:val="111111"/>
+                <w:sz w:val="17"/>
+              </w:rPr>
+              <w:t>제품 이미지</w:t>
+            </w:r>
+          </w:p>
+        </w:tc>
+        <w:tc>
+          <w:tcPr>
+            <w:tcW w:type="dxa" w:w="4309"/>
+          </w:tcPr>
+          <w:p>
+            <w:r/>
+            <w:r>
+              <w:rPr>
+                <w:rFonts w:ascii="Pretendard" w:hAnsi="Pretendard" w:eastAsia="Pretendard"/>
+                <w:b w:val="0"/>
+                <w:i w:val="0"/>
+                <w:color w:val="111111"/>
+                <w:sz w:val="17"/>
+              </w:rPr>
+              <w:t>코키(QOQI)·Challpak 10종, 캐슈넛·소금 견과 믹스·참깨 페이스트·바질 쿠르트 재누끼, 단단한 쿠르트(Toshqurt) 추가, 매운 고추 쿠르트 사진 정정</w:t>
+            </w:r>
+          </w:p>
+        </w:tc>
+        <w:tc>
+          <w:tcPr>
+            <w:tcW w:type="dxa" w:w="3969"/>
+          </w:tcPr>
+          <w:p>
+            <w:r/>
+            <w:r>
+              <w:rPr>
+                <w:rFonts w:ascii="Pretendard" w:hAnsi="Pretendard" w:eastAsia="Pretendard"/>
+                <w:b w:val="0"/>
+                <w:i w:val="0"/>
+                <w:color w:val="111111"/>
+                <w:sz w:val="17"/>
+              </w:rPr>
+              <w:t>해당 제품은 카탈로그 실사진으로 완료 — 추가 생성 불필요</w:t>
+            </w:r>
+          </w:p>
+        </w:tc>
+      </w:tr>
+      <w:tr>
+        <w:tc>
+          <w:tcPr>
+            <w:tcW w:type="dxa" w:w="1361"/>
+          </w:tcPr>
+          <w:p>
+            <w:r/>
+            <w:r>
+              <w:rPr>
+                <w:rFonts w:ascii="Pretendard" w:hAnsi="Pretendard" w:eastAsia="Pretendard"/>
+                <w:b/>
+                <w:i w:val="0"/>
+                <w:color w:val="111111"/>
+                <w:sz w:val="17"/>
+              </w:rPr>
+              <w:t>회사 정보</w:t>
+            </w:r>
+          </w:p>
+        </w:tc>
+        <w:tc>
+          <w:tcPr>
+            <w:tcW w:type="dxa" w:w="4309"/>
+          </w:tcPr>
+          <w:p>
+            <w:r/>
+            <w:r>
+              <w:rPr>
+                <w:rFonts w:ascii="Pretendard" w:hAnsi="Pretendard" w:eastAsia="Pretendard"/>
+                <w:b w:val="0"/>
+                <w:i w:val="0"/>
+                <w:color w:val="111111"/>
+                <w:sz w:val="17"/>
+              </w:rPr>
+              <w:t>CEO 박진태 · 정보관리책임자 박진태 · 임직원 850+(ERMÁK)</w:t>
+            </w:r>
+          </w:p>
+        </w:tc>
+        <w:tc>
+          <w:tcPr>
+            <w:tcW w:type="dxa" w:w="3969"/>
+          </w:tcPr>
+          <w:p>
+            <w:r/>
+            <w:r>
+              <w:rPr>
+                <w:rFonts w:ascii="Pretendard" w:hAnsi="Pretendard" w:eastAsia="Pretendard"/>
+                <w:b w:val="0"/>
+                <w:i w:val="0"/>
+                <w:color w:val="111111"/>
+                <w:sz w:val="17"/>
+              </w:rPr>
+              <w:t>텍스트 변경만 — 이미지 영향 없음</w:t>
+            </w:r>
+          </w:p>
+        </w:tc>
+      </w:tr>
+      <w:tr>
+        <w:tc>
+          <w:tcPr>
+            <w:tcW w:type="dxa" w:w="1361"/>
+          </w:tcPr>
+          <w:p>
+            <w:r/>
+            <w:r>
+              <w:rPr>
+                <w:rFonts w:ascii="Pretendard" w:hAnsi="Pretendard" w:eastAsia="Pretendard"/>
+                <w:b/>
+                <w:i w:val="0"/>
+                <w:color w:val="111111"/>
+                <w:sz w:val="17"/>
+              </w:rPr>
+              <w:t>창립자 섹션</w:t>
+            </w:r>
+          </w:p>
+        </w:tc>
+        <w:tc>
+          <w:tcPr>
+            <w:tcW w:type="dxa" w:w="4309"/>
+          </w:tcPr>
+          <w:p>
+            <w:r/>
+            <w:r>
+              <w:rPr>
+                <w:rFonts w:ascii="Pretendard" w:hAnsi="Pretendard" w:eastAsia="Pretendard"/>
+                <w:b w:val="0"/>
+                <w:i w:val="0"/>
+                <w:color w:val="111111"/>
+                <w:sz w:val="17"/>
+              </w:rPr>
+              <w:t>Valijon Salixov 인용 섹션 사진을 상체 구도로 재배치</w:t>
+            </w:r>
+          </w:p>
+        </w:tc>
+        <w:tc>
+          <w:tcPr>
+            <w:tcW w:type="dxa" w:w="3969"/>
+          </w:tcPr>
+          <w:p>
+            <w:r/>
+            <w:r>
+              <w:rPr>
+                <w:rFonts w:ascii="Pretendard" w:hAnsi="Pretendard" w:eastAsia="Pretendard"/>
+                <w:b w:val="0"/>
+                <w:i w:val="0"/>
+                <w:color w:val="111111"/>
+                <w:sz w:val="17"/>
+              </w:rPr>
+              <w:t>원본 288×431px 저해상도 — 고해상도 실사진 확보 권장</w:t>
+            </w:r>
+          </w:p>
+        </w:tc>
+      </w:tr>
+    </w:tbl>
+    <w:p/>
+    <w:p>
+      <w:r>
+        <w:rPr>
+          <w:rFonts w:ascii="Pretendard" w:hAnsi="Pretendard" w:eastAsia="Pretendard"/>
+          <w:b/>
+          <w:i w:val="0"/>
+          <w:color w:val="111111"/>
+          <w:sz w:val="24"/>
+        </w:rPr>
+        <w:t>실사진 확보 권장 목록 (AI 생성 대신 실제 사진 사용)</w:t>
+      </w:r>
+    </w:p>
+    <w:tbl>
+      <w:tblPr>
+        <w:tblStyle w:val="TableGrid"/>
+        <w:tblW w:type="auto" w:w="0"/>
+        <w:tblLook w:firstColumn="1" w:firstRow="1" w:lastColumn="0" w:lastRow="0" w:noHBand="0" w:noVBand="1" w:val="04A0"/>
+      </w:tblPr>
+      <w:tblGrid>
+        <w:gridCol w:w="2493"/>
+        <w:gridCol w:w="2493"/>
+        <w:gridCol w:w="2493"/>
+        <w:gridCol w:w="2493"/>
+      </w:tblGrid>
+      <w:tr>
+        <w:tc>
+          <w:tcPr>
+            <w:tcW w:type="dxa" w:w="2381"/>
+            <w:shd w:val="clear" w:color="auto" w:fill="111111"/>
+          </w:tcPr>
+          <w:p>
+            <w:r/>
+            <w:r>
+              <w:rPr>
+                <w:rFonts w:ascii="Pretendard" w:hAnsi="Pretendard" w:eastAsia="Pretendard"/>
+                <w:b/>
+                <w:i w:val="0"/>
+                <w:color w:val="D4B46A"/>
+                <w:sz w:val="18"/>
+              </w:rPr>
+              <w:t>대상</w:t>
+            </w:r>
+          </w:p>
+        </w:tc>
+        <w:tc>
+          <w:tcPr>
+            <w:tcW w:type="dxa" w:w="2494"/>
+            <w:shd w:val="clear" w:color="auto" w:fill="111111"/>
+          </w:tcPr>
+          <w:p>
+            <w:r/>
+            <w:r>
+              <w:rPr>
+                <w:rFonts w:ascii="Pretendard" w:hAnsi="Pretendard" w:eastAsia="Pretendard"/>
+                <w:b/>
+                <w:i w:val="0"/>
+                <w:color w:val="D4B46A"/>
+                <w:sz w:val="18"/>
+              </w:rPr>
+              <w:t>사이트 위치</w:t>
+            </w:r>
+          </w:p>
+        </w:tc>
+        <w:tc>
+          <w:tcPr>
+            <w:tcW w:type="dxa" w:w="2835"/>
+            <w:shd w:val="clear" w:color="auto" w:fill="111111"/>
+          </w:tcPr>
+          <w:p>
+            <w:r/>
+            <w:r>
+              <w:rPr>
+                <w:rFonts w:ascii="Pretendard" w:hAnsi="Pretendard" w:eastAsia="Pretendard"/>
+                <w:b/>
+                <w:i w:val="0"/>
+                <w:color w:val="D4B46A"/>
+                <w:sz w:val="18"/>
+              </w:rPr>
+              <w:t>권장 사양</w:t>
+            </w:r>
+          </w:p>
+        </w:tc>
+        <w:tc>
+          <w:tcPr>
+            <w:tcW w:type="dxa" w:w="1928"/>
+            <w:shd w:val="clear" w:color="auto" w:fill="111111"/>
+          </w:tcPr>
+          <w:p>
+            <w:r/>
+            <w:r>
+              <w:rPr>
+                <w:rFonts w:ascii="Pretendard" w:hAnsi="Pretendard" w:eastAsia="Pretendard"/>
+                <w:b/>
+                <w:i w:val="0"/>
+                <w:color w:val="D4B46A"/>
+                <w:sz w:val="18"/>
+              </w:rPr>
+              <w:t>요청처</w:t>
+            </w:r>
+          </w:p>
+        </w:tc>
+      </w:tr>
+      <w:tr>
+        <w:tc>
+          <w:tcPr>
+            <w:tcW w:type="dxa" w:w="2381"/>
+          </w:tcPr>
+          <w:p>
+            <w:r/>
+            <w:r>
+              <w:rPr>
+                <w:rFonts w:ascii="Pretendard" w:hAnsi="Pretendard" w:eastAsia="Pretendard"/>
+                <w:b/>
+                <w:i w:val="0"/>
+                <w:color w:val="111111"/>
+                <w:sz w:val="17"/>
+              </w:rPr>
+              <w:t>ERMÁK 창립자 Valijon Salixov 인물 사진</w:t>
+            </w:r>
+          </w:p>
+        </w:tc>
+        <w:tc>
+          <w:tcPr>
+            <w:tcW w:type="dxa" w:w="2494"/>
+          </w:tcPr>
+          <w:p>
+            <w:r/>
+            <w:r>
+              <w:rPr>
+                <w:rFonts w:ascii="Pretendard" w:hAnsi="Pretendard" w:eastAsia="Pretendard"/>
+                <w:b w:val="0"/>
+                <w:i w:val="0"/>
+                <w:color w:val="111111"/>
+                <w:sz w:val="17"/>
+              </w:rPr>
+              <w:t>SOLKERN 페이지 창립자 인용 섹션(우측)</w:t>
+            </w:r>
+          </w:p>
+        </w:tc>
+        <w:tc>
+          <w:tcPr>
+            <w:tcW w:type="dxa" w:w="2835"/>
+          </w:tcPr>
+          <w:p>
+            <w:r/>
+            <w:r>
+              <w:rPr>
+                <w:rFonts w:ascii="Pretendard" w:hAnsi="Pretendard" w:eastAsia="Pretendard"/>
+                <w:b w:val="0"/>
+                <w:i w:val="0"/>
+                <w:color w:val="111111"/>
+                <w:sz w:val="17"/>
+              </w:rPr>
+              <w:t>세로 2:3, 긴 변 1500px 이상, 머리~허리 상반신, 공장·과수원 배경</w:t>
+            </w:r>
+          </w:p>
+        </w:tc>
+        <w:tc>
+          <w:tcPr>
+            <w:tcW w:type="dxa" w:w="1928"/>
+          </w:tcPr>
+          <w:p>
+            <w:r/>
+            <w:r>
+              <w:rPr>
+                <w:rFonts w:ascii="Pretendard" w:hAnsi="Pretendard" w:eastAsia="Pretendard"/>
+                <w:b w:val="0"/>
+                <w:i w:val="0"/>
+                <w:color w:val="111111"/>
+                <w:sz w:val="17"/>
+              </w:rPr>
+              <w:t>ZAFARXON / ERMÁK 본사</w:t>
+            </w:r>
+          </w:p>
+        </w:tc>
+      </w:tr>
+      <w:tr>
+        <w:tc>
+          <w:tcPr>
+            <w:tcW w:type="dxa" w:w="2381"/>
+          </w:tcPr>
+          <w:p>
+            <w:r/>
+            <w:r>
+              <w:rPr>
+                <w:rFonts w:ascii="Pretendard" w:hAnsi="Pretendard" w:eastAsia="Pretendard"/>
+                <w:b/>
+                <w:i w:val="0"/>
+                <w:color w:val="111111"/>
+                <w:sz w:val="17"/>
+              </w:rPr>
+              <w:t>3사 미팅·계약 사진</w:t>
+            </w:r>
+          </w:p>
+        </w:tc>
+        <w:tc>
+          <w:tcPr>
+            <w:tcW w:type="dxa" w:w="2494"/>
+          </w:tcPr>
+          <w:p>
+            <w:r/>
+            <w:r>
+              <w:rPr>
+                <w:rFonts w:ascii="Pretendard" w:hAnsi="Pretendard" w:eastAsia="Pretendard"/>
+                <w:b w:val="0"/>
+                <w:i w:val="0"/>
+                <w:color w:val="111111"/>
+                <w:sz w:val="17"/>
+              </w:rPr>
+              <w:t>ABOUT-TEAM</w:t>
+            </w:r>
+          </w:p>
+        </w:tc>
+        <w:tc>
+          <w:tcPr>
+            <w:tcW w:type="dxa" w:w="2835"/>
+          </w:tcPr>
+          <w:p>
+            <w:r/>
+            <w:r>
+              <w:rPr>
+                <w:rFonts w:ascii="Pretendard" w:hAnsi="Pretendard" w:eastAsia="Pretendard"/>
+                <w:b w:val="0"/>
+                <w:i w:val="0"/>
+                <w:color w:val="111111"/>
+                <w:sz w:val="17"/>
+              </w:rPr>
+              <w:t>가로 4:3, 1600px 이상, 얼굴 노출 동의 확보</w:t>
+            </w:r>
+          </w:p>
+        </w:tc>
+        <w:tc>
+          <w:tcPr>
+            <w:tcW w:type="dxa" w:w="1928"/>
+          </w:tcPr>
+          <w:p>
+            <w:r/>
+            <w:r>
+              <w:rPr>
+                <w:rFonts w:ascii="Pretendard" w:hAnsi="Pretendard" w:eastAsia="Pretendard"/>
+                <w:b w:val="0"/>
+                <w:i w:val="0"/>
+                <w:color w:val="111111"/>
+                <w:sz w:val="17"/>
+              </w:rPr>
+              <w:t>ZAFARXON · CATKIN · SOLKERN</w:t>
+            </w:r>
+          </w:p>
+        </w:tc>
+      </w:tr>
+      <w:tr>
+        <w:tc>
+          <w:tcPr>
+            <w:tcW w:type="dxa" w:w="2381"/>
+          </w:tcPr>
+          <w:p>
+            <w:r/>
+            <w:r>
+              <w:rPr>
+                <w:rFonts w:ascii="Pretendard" w:hAnsi="Pretendard" w:eastAsia="Pretendard"/>
+                <w:b/>
+                <w:i w:val="0"/>
+                <w:color w:val="111111"/>
+                <w:sz w:val="17"/>
+              </w:rPr>
+              <w:t>인천 청라 오피스</w:t>
+            </w:r>
+          </w:p>
+        </w:tc>
+        <w:tc>
+          <w:tcPr>
+            <w:tcW w:type="dxa" w:w="2494"/>
+          </w:tcPr>
+          <w:p>
+            <w:r/>
+            <w:r>
+              <w:rPr>
+                <w:rFonts w:ascii="Pretendard" w:hAnsi="Pretendard" w:eastAsia="Pretendard"/>
+                <w:b w:val="0"/>
+                <w:i w:val="0"/>
+                <w:color w:val="111111"/>
+                <w:sz w:val="17"/>
+              </w:rPr>
+              <w:t>ABOUT-OFFICE · CONTACT-OFFICE</w:t>
+            </w:r>
+          </w:p>
+        </w:tc>
+        <w:tc>
+          <w:tcPr>
+            <w:tcW w:type="dxa" w:w="2835"/>
+          </w:tcPr>
+          <w:p>
+            <w:r/>
+            <w:r>
+              <w:rPr>
+                <w:rFonts w:ascii="Pretendard" w:hAnsi="Pretendard" w:eastAsia="Pretendard"/>
+                <w:b w:val="0"/>
+                <w:i w:val="0"/>
+                <w:color w:val="111111"/>
+                <w:sz w:val="17"/>
+              </w:rPr>
+              <w:t>가로 16:9 / 21:9, 밝은 자연광</w:t>
+            </w:r>
+          </w:p>
+        </w:tc>
+        <w:tc>
+          <w:tcPr>
+            <w:tcW w:type="dxa" w:w="1928"/>
+          </w:tcPr>
+          <w:p>
+            <w:r/>
+            <w:r>
+              <w:rPr>
+                <w:rFonts w:ascii="Pretendard" w:hAnsi="Pretendard" w:eastAsia="Pretendard"/>
+                <w:b w:val="0"/>
+                <w:i w:val="0"/>
+                <w:color w:val="111111"/>
+                <w:sz w:val="17"/>
+              </w:rPr>
+              <w:t>SOLKERN</w:t>
+            </w:r>
+          </w:p>
+        </w:tc>
+      </w:tr>
+      <w:tr>
+        <w:tc>
+          <w:tcPr>
+            <w:tcW w:type="dxa" w:w="2381"/>
+          </w:tcPr>
+          <w:p>
+            <w:r/>
+            <w:r>
+              <w:rPr>
+                <w:rFonts w:ascii="Pretendard" w:hAnsi="Pretendard" w:eastAsia="Pretendard"/>
+                <w:b/>
+                <w:i w:val="0"/>
+                <w:color w:val="111111"/>
+                <w:sz w:val="17"/>
+              </w:rPr>
+              <w:t>ERMÁK 생산 라인</w:t>
+            </w:r>
+          </w:p>
+        </w:tc>
+        <w:tc>
+          <w:tcPr>
+            <w:tcW w:type="dxa" w:w="2494"/>
+          </w:tcPr>
+          <w:p>
+            <w:r/>
+            <w:r>
+              <w:rPr>
+                <w:rFonts w:ascii="Pretendard" w:hAnsi="Pretendard" w:eastAsia="Pretendard"/>
+                <w:b w:val="0"/>
+                <w:i w:val="0"/>
+                <w:color w:val="111111"/>
+                <w:sz w:val="17"/>
+              </w:rPr>
+              <w:t>ORIGIN-FACTORY</w:t>
+            </w:r>
+          </w:p>
+        </w:tc>
+        <w:tc>
+          <w:tcPr>
+            <w:tcW w:type="dxa" w:w="2835"/>
+          </w:tcPr>
+          <w:p>
+            <w:r/>
+            <w:r>
+              <w:rPr>
+                <w:rFonts w:ascii="Pretendard" w:hAnsi="Pretendard" w:eastAsia="Pretendard"/>
+                <w:b w:val="0"/>
+                <w:i w:val="0"/>
+                <w:color w:val="111111"/>
+                <w:sz w:val="17"/>
+              </w:rPr>
+              <w:t>가로 4:3, 위생복 착용 장면, 어두운 배경 권장</w:t>
+            </w:r>
+          </w:p>
+        </w:tc>
+        <w:tc>
+          <w:tcPr>
+            <w:tcW w:type="dxa" w:w="1928"/>
+          </w:tcPr>
+          <w:p>
+            <w:r/>
+            <w:r>
+              <w:rPr>
+                <w:rFonts w:ascii="Pretendard" w:hAnsi="Pretendard" w:eastAsia="Pretendard"/>
+                <w:b w:val="0"/>
+                <w:i w:val="0"/>
+                <w:color w:val="111111"/>
+                <w:sz w:val="17"/>
+              </w:rPr>
+              <w:t>ERMÁK 본사(타슈켄트·지자흐 공장)</w:t>
+            </w:r>
+          </w:p>
+        </w:tc>
+      </w:tr>
+      <w:tr>
+        <w:tc>
+          <w:tcPr>
+            <w:tcW w:type="dxa" w:w="2381"/>
+          </w:tcPr>
+          <w:p>
+            <w:r/>
+            <w:r>
+              <w:rPr>
+                <w:rFonts w:ascii="Pretendard" w:hAnsi="Pretendard" w:eastAsia="Pretendard"/>
+                <w:b/>
+                <w:i w:val="0"/>
+                <w:color w:val="111111"/>
+                <w:sz w:val="17"/>
+              </w:rPr>
+              <w:t>체리·살구·모과 잼 / 과일 퓨레 제품 컷</w:t>
+            </w:r>
+          </w:p>
+        </w:tc>
+        <w:tc>
+          <w:tcPr>
+            <w:tcW w:type="dxa" w:w="2494"/>
+          </w:tcPr>
+          <w:p>
+            <w:r/>
+            <w:r>
+              <w:rPr>
+                <w:rFonts w:ascii="Pretendard" w:hAnsi="Pretendard" w:eastAsia="Pretendard"/>
+                <w:b w:val="0"/>
+                <w:i w:val="0"/>
+                <w:color w:val="111111"/>
+                <w:sz w:val="17"/>
+              </w:rPr>
+              <w:t>PROD-JAM-TRIO · PROD-PUREE</w:t>
+            </w:r>
+          </w:p>
+        </w:tc>
+        <w:tc>
+          <w:tcPr>
+            <w:tcW w:type="dxa" w:w="2835"/>
+          </w:tcPr>
+          <w:p>
+            <w:r/>
+            <w:r>
+              <w:rPr>
+                <w:rFonts w:ascii="Pretendard" w:hAnsi="Pretendard" w:eastAsia="Pretendard"/>
+                <w:b w:val="0"/>
+                <w:i w:val="0"/>
+                <w:color w:val="111111"/>
+                <w:sz w:val="17"/>
+              </w:rPr>
+              <w:t>정사각 1:1, 1000px 이상, 투명 배경 누끼(그림자·후광 없음)</w:t>
+            </w:r>
+          </w:p>
+        </w:tc>
+        <w:tc>
+          <w:tcPr>
+            <w:tcW w:type="dxa" w:w="1928"/>
+          </w:tcPr>
+          <w:p>
+            <w:r/>
+            <w:r>
+              <w:rPr>
+                <w:rFonts w:ascii="Pretendard" w:hAnsi="Pretendard" w:eastAsia="Pretendard"/>
+                <w:b w:val="0"/>
+                <w:i w:val="0"/>
+                <w:color w:val="111111"/>
+                <w:sz w:val="17"/>
+              </w:rPr>
+              <w:t>ERMÁK 본사 제품 원본 이미지</w:t>
+            </w:r>
+          </w:p>
+        </w:tc>
+      </w:tr>
+    </w:tbl>
+    <w:p>
+      <w:r>
+        <w:br w:type="page"/>
+      </w:r>
+    </w:p>
+    <w:p>
+      <w:r>
+        <w:rPr>
+          <w:rFonts w:ascii="Pretendard" w:hAnsi="Pretendard" w:eastAsia="Pretendard"/>
+          <w:b/>
+          <w:i w:val="0"/>
+          <w:color w:val="111111"/>
+          <w:sz w:val="24"/>
+        </w:rPr>
+        <w:t>플레이스홀더 목록 (현재 사이트에 표시 중인 25개)</w:t>
       </w:r>
     </w:p>
     <w:tbl>
@@ -800,7 +1800,7 @@
                 <w:color w:val="111111"/>
                 <w:sz w:val="17"/>
               </w:rPr>
-              <w:t>투명 배경 원물 컷. 기존 석류·사과·체리 PNG와 동일한 스타일.</w:t>
+              <w:t>투명 배경 원물 컷. 기존 석류·사과·체리 PNG와 동일한 스타일. 그림자·후광 없이 생성 후 누끼.</w:t>
             </w:r>
           </w:p>
         </w:tc>
@@ -1504,7 +2504,7 @@
                 <w:color w:val="111111"/>
                 <w:sz w:val="17"/>
               </w:rPr>
-              <w:t>홈 JOURNEY 04 MARKET</w:t>
+              <w:t>홈 JOURNEY 04 MARKET 카드 (홈 08 MARKET 섹션은 인터랙티브 세계지도로 이미 구현 — 이미지 불필요)</w:t>
             </w:r>
           </w:p>
         </w:tc>
@@ -1522,7 +2522,7 @@
                 <w:color w:val="111111"/>
                 <w:sz w:val="17"/>
               </w:rPr>
-              <w:t>16:9 / 4:3</w:t>
+              <w:t>4:3</w:t>
             </w:r>
           </w:p>
         </w:tc>
@@ -1540,7 +2540,7 @@
                 <w:color w:val="111111"/>
                 <w:sz w:val="17"/>
               </w:rPr>
-              <w:t>아시아 유통·물류 네트워크. 추상적·미니멀 다크 톤.</w:t>
+              <w:t>아시아·태평양 12개국 공동진출 네트워크의 감성 컷. 사이트 지도와 같은 색 체계(차콜 #111 바탕 · 골드 #B49141 판권국 · 버건디 원산지)로 통일.</w:t>
             </w:r>
           </w:p>
         </w:tc>
@@ -1578,7 +2578,7 @@
                 <w:color w:val="111111"/>
                 <w:sz w:val="17"/>
               </w:rPr>
-              <w:t>SOLKERN 페이지 PARTNERS 섹션</w:t>
+              <w:t>SOLKERN 페이지 PARTNERS 섹션 ('생산에서 판매까지, 3사 협력 구조')</w:t>
             </w:r>
           </w:p>
         </w:tc>
@@ -1614,7 +2614,7 @@
                 <w:color w:val="111111"/>
                 <w:sz w:val="17"/>
               </w:rPr>
-              <w:t>3사 협력의 신뢰감. 실제 팀 사진으로 교체 권장.</w:t>
+              <w:t>ZAFARXON·ERMÁK(생산) × CATKIN(수입·통관) × SOLKERN(판매·R&amp;D) — 'ERMÁK 아시아 공동진출 공식파트너' 관계의 신뢰감. 실제 3사 미팅 사진으로 교체 강력 권장.</w:t>
             </w:r>
           </w:p>
         </w:tc>
@@ -1836,7 +2836,7 @@
                 <w:color w:val="111111"/>
                 <w:sz w:val="17"/>
               </w:rPr>
-              <w:t>실제 제품 컷 교체 권장(카탈로그 p.12).</w:t>
+              <w:t>실제 제품 컷 교체 권장(카탈로그 p.12). ERMÁK 제품 카드는 사이트가 스포트라이트·후광·바닥 반사를 자동으로 입히므로, 이미지 자체에는 그림자·빛번짐·후광이 없어야 함(완전 투명 배경).</w:t>
             </w:r>
           </w:p>
         </w:tc>
@@ -1910,7 +2910,7 @@
                 <w:color w:val="111111"/>
                 <w:sz w:val="17"/>
               </w:rPr>
-              <w:t>실제 제품 컷 교체 권장(카탈로그 KO p.16).</w:t>
+              <w:t>실제 제품 컷 교체 권장(카탈로그 KO p.16). 그림자·후광 없는 완전 투명 배경 누끼 필수(사이트 공통 조명 적용).</w:t>
             </w:r>
           </w:p>
         </w:tc>
@@ -2425,6 +3425,45 @@
                 <w:color w:val="111111"/>
                 <w:sz w:val="18"/>
               </w:rPr>
+              <w:t>Nano Banana / Flux</w:t>
+            </w:r>
+          </w:p>
+        </w:tc>
+        <w:tc>
+          <w:tcPr>
+            <w:tcW w:type="dxa" w:w="7937"/>
+          </w:tcPr>
+          <w:p>
+            <w:r/>
+            <w:r>
+              <w:rPr>
+                <w:rFonts w:ascii="Pretendard" w:hAnsi="Pretendard" w:eastAsia="Pretendard"/>
+                <w:b w:val="0"/>
+                <w:i w:val="0"/>
+                <w:color w:val="111111"/>
+                <w:sz w:val="18"/>
+              </w:rPr>
+              <w:t>Wide shot of a sun-drenched pomegranate orchard in the Fergana Valley, Uzbekistan, late afternoon golden backlight through leaves, ripe pomegranates on branches, dusty warm soil path, distant hazy mountains, a farmer's hand gently holding a fruit in the foreground. Style: editorial food &amp; origin photography, photorealistic, natural warm light, muted palette of ivory, soil brown, pomegranate burgundy, apricot orange and leaf green with subtle gold accents, shallow depth of field, 35mm lens, premium brand-site quality, no text, no logos, no watermark. Aspect ratio 16:11. Avoid: text, letters, logo, watermark, cartoon, illustration, oversaturated, HDR, plastic look, extra fingers, deformed fruit, cluttered background.</w:t>
+            </w:r>
+          </w:p>
+        </w:tc>
+      </w:tr>
+      <w:tr>
+        <w:tc>
+          <w:tcPr>
+            <w:tcW w:type="dxa" w:w="1701"/>
+            <w:shd w:val="clear" w:color="auto" w:fill="F3EAD3"/>
+          </w:tcPr>
+          <w:p>
+            <w:r/>
+            <w:r>
+              <w:rPr>
+                <w:rFonts w:ascii="Pretendard" w:hAnsi="Pretendard" w:eastAsia="Pretendard"/>
+                <w:b/>
+                <w:i w:val="0"/>
+                <w:color w:val="111111"/>
+                <w:sz w:val="18"/>
+              </w:rPr>
               <w:t>네거티브</w:t>
             </w:r>
           </w:p>
@@ -2732,6 +3771,45 @@
                 <w:color w:val="111111"/>
                 <w:sz w:val="18"/>
               </w:rPr>
+              <w:t>Nano Banana / Flux</w:t>
+            </w:r>
+          </w:p>
+        </w:tc>
+        <w:tc>
+          <w:tcPr>
+            <w:tcW w:type="dxa" w:w="7937"/>
+          </w:tcPr>
+          <w:p>
+            <w:r/>
+            <w:r>
+              <w:rPr>
+                <w:rFonts w:ascii="Pretendard" w:hAnsi="Pretendard" w:eastAsia="Pretendard"/>
+                <w:b w:val="0"/>
+                <w:i w:val="0"/>
+                <w:color w:val="111111"/>
+                <w:sz w:val="18"/>
+              </w:rPr>
+              <w:t>Morning sunlight bursting over an apricot orchard in Central Asia, sun flare between branches, dew on fruit skin, warm amber sky, silhouettes of low trees and a mud-brick wall, serene and vast. Style: editorial food &amp; origin photography, photorealistic, natural warm light, muted palette of ivory, soil brown, pomegranate burgundy, apricot orange and leaf green with subtle gold accents, shallow depth of field, 35mm lens, premium brand-site quality, no text, no logos, no watermark. Aspect ratio 4:3. Avoid: text, letters, logo, watermark, cartoon, illustration, oversaturated, HDR, plastic look, extra fingers, deformed fruit, cluttered background.</w:t>
+            </w:r>
+          </w:p>
+        </w:tc>
+      </w:tr>
+      <w:tr>
+        <w:tc>
+          <w:tcPr>
+            <w:tcW w:type="dxa" w:w="1701"/>
+            <w:shd w:val="clear" w:color="auto" w:fill="F3EAD3"/>
+          </w:tcPr>
+          <w:p>
+            <w:r/>
+            <w:r>
+              <w:rPr>
+                <w:rFonts w:ascii="Pretendard" w:hAnsi="Pretendard" w:eastAsia="Pretendard"/>
+                <w:b/>
+                <w:i w:val="0"/>
+                <w:color w:val="111111"/>
+                <w:sz w:val="18"/>
+              </w:rPr>
               <w:t>네거티브</w:t>
             </w:r>
           </w:p>
@@ -3039,6 +4117,45 @@
                 <w:color w:val="111111"/>
                 <w:sz w:val="18"/>
               </w:rPr>
+              <w:t>Nano Banana / Flux</w:t>
+            </w:r>
+          </w:p>
+        </w:tc>
+        <w:tc>
+          <w:tcPr>
+            <w:tcW w:type="dxa" w:w="7937"/>
+          </w:tcPr>
+          <w:p>
+            <w:r/>
+            <w:r>
+              <w:rPr>
+                <w:rFonts w:ascii="Pretendard" w:hAnsi="Pretendard" w:eastAsia="Pretendard"/>
+                <w:b w:val="0"/>
+                <w:i w:val="0"/>
+                <w:color w:val="111111"/>
+                <w:sz w:val="18"/>
+              </w:rPr>
+              <w:t>Close-up of cupped hands holding rich reddish-brown soil with two fresh apricots, an irrigation canal reflecting sky in the background, dry steppe air, Tian Shan mountains softly out of focus. Style: editorial food &amp; origin photography, photorealistic, natural warm light, muted palette of ivory, soil brown, pomegranate burgundy, apricot orange and leaf green with subtle gold accents, shallow depth of field, 35mm lens, premium brand-site quality, no text, no logos, no watermark. Aspect ratio 4:3. Avoid: text, letters, logo, watermark, cartoon, illustration, oversaturated, HDR, plastic look, extra fingers, deformed fruit, cluttered background.</w:t>
+            </w:r>
+          </w:p>
+        </w:tc>
+      </w:tr>
+      <w:tr>
+        <w:tc>
+          <w:tcPr>
+            <w:tcW w:type="dxa" w:w="1701"/>
+            <w:shd w:val="clear" w:color="auto" w:fill="F3EAD3"/>
+          </w:tcPr>
+          <w:p>
+            <w:r/>
+            <w:r>
+              <w:rPr>
+                <w:rFonts w:ascii="Pretendard" w:hAnsi="Pretendard" w:eastAsia="Pretendard"/>
+                <w:b/>
+                <w:i w:val="0"/>
+                <w:color w:val="111111"/>
+                <w:sz w:val="18"/>
+              </w:rPr>
               <w:t>네거티브</w:t>
             </w:r>
           </w:p>
@@ -3346,6 +4463,45 @@
                 <w:color w:val="111111"/>
                 <w:sz w:val="18"/>
               </w:rPr>
+              <w:t>Nano Banana / Flux</w:t>
+            </w:r>
+          </w:p>
+        </w:tc>
+        <w:tc>
+          <w:tcPr>
+            <w:tcW w:type="dxa" w:w="7937"/>
+          </w:tcPr>
+          <w:p>
+            <w:r/>
+            <w:r>
+              <w:rPr>
+                <w:rFonts w:ascii="Pretendard" w:hAnsi="Pretendard" w:eastAsia="Pretendard"/>
+                <w:b w:val="0"/>
+                <w:i w:val="0"/>
+                <w:color w:val="111111"/>
+                <w:sz w:val="18"/>
+              </w:rPr>
+              <w:t>Apricots drying on woven mats on a flat rooftop in an Uzbek village at golden hour, rows of orange fruit, an elderly woman in a patterned dress arranging them, minarets and poplar trees in the distance, documentary style. Style: editorial food &amp; origin photography, photorealistic, natural warm light, muted palette of ivory, soil brown, pomegranate burgundy, apricot orange and leaf green with subtle gold accents, shallow depth of field, 35mm lens, premium brand-site quality, no text, no logos, no watermark. Aspect ratio 4:3. Avoid: text, letters, logo, watermark, cartoon, illustration, oversaturated, HDR, plastic look, extra fingers, deformed fruit, cluttered background.</w:t>
+            </w:r>
+          </w:p>
+        </w:tc>
+      </w:tr>
+      <w:tr>
+        <w:tc>
+          <w:tcPr>
+            <w:tcW w:type="dxa" w:w="1701"/>
+            <w:shd w:val="clear" w:color="auto" w:fill="F3EAD3"/>
+          </w:tcPr>
+          <w:p>
+            <w:r/>
+            <w:r>
+              <w:rPr>
+                <w:rFonts w:ascii="Pretendard" w:hAnsi="Pretendard" w:eastAsia="Pretendard"/>
+                <w:b/>
+                <w:i w:val="0"/>
+                <w:color w:val="111111"/>
+                <w:sz w:val="18"/>
+              </w:rPr>
               <w:t>네거티브</w:t>
             </w:r>
           </w:p>
@@ -3653,6 +4809,45 @@
                 <w:color w:val="111111"/>
                 <w:sz w:val="18"/>
               </w:rPr>
+              <w:t>Nano Banana / Flux</w:t>
+            </w:r>
+          </w:p>
+        </w:tc>
+        <w:tc>
+          <w:tcPr>
+            <w:tcW w:type="dxa" w:w="7937"/>
+          </w:tcPr>
+          <w:p>
+            <w:r/>
+            <w:r>
+              <w:rPr>
+                <w:rFonts w:ascii="Pretendard" w:hAnsi="Pretendard" w:eastAsia="Pretendard"/>
+                <w:b w:val="0"/>
+                <w:i w:val="0"/>
+                <w:color w:val="111111"/>
+                <w:sz w:val="18"/>
+              </w:rPr>
+              <w:t>Clean modern juice production line, stainless steel press and glass bottles being filled with deep red pomegranate juice, soft directional light, dark charcoal background, worker in white coat and hairnet slightly out of focus. Style: editorial food &amp; origin photography, photorealistic, natural warm light, muted palette of ivory, soil brown, pomegranate burgundy, apricot orange and leaf green with subtle gold accents, shallow depth of field, 35mm lens, premium brand-site quality, no text, no logos, no watermark. Aspect ratio 4:3. Avoid: text, letters, logo, watermark, cartoon, illustration, oversaturated, HDR, plastic look, extra fingers, deformed fruit, cluttered background.</w:t>
+            </w:r>
+          </w:p>
+        </w:tc>
+      </w:tr>
+      <w:tr>
+        <w:tc>
+          <w:tcPr>
+            <w:tcW w:type="dxa" w:w="1701"/>
+            <w:shd w:val="clear" w:color="auto" w:fill="F3EAD3"/>
+          </w:tcPr>
+          <w:p>
+            <w:r/>
+            <w:r>
+              <w:rPr>
+                <w:rFonts w:ascii="Pretendard" w:hAnsi="Pretendard" w:eastAsia="Pretendard"/>
+                <w:b/>
+                <w:i w:val="0"/>
+                <w:color w:val="111111"/>
+                <w:sz w:val="18"/>
+              </w:rPr>
               <w:t>네거티브</w:t>
             </w:r>
           </w:p>
@@ -3960,6 +5155,45 @@
                 <w:color w:val="111111"/>
                 <w:sz w:val="18"/>
               </w:rPr>
+              <w:t>Nano Banana / Flux</w:t>
+            </w:r>
+          </w:p>
+        </w:tc>
+        <w:tc>
+          <w:tcPr>
+            <w:tcW w:type="dxa" w:w="7937"/>
+          </w:tcPr>
+          <w:p>
+            <w:r/>
+            <w:r>
+              <w:rPr>
+                <w:rFonts w:ascii="Pretendard" w:hAnsi="Pretendard" w:eastAsia="Pretendard"/>
+                <w:b w:val="0"/>
+                <w:i w:val="0"/>
+                <w:color w:val="111111"/>
+                <w:sz w:val="18"/>
+              </w:rPr>
+              <w:t>Anatolian hillside orchard at sunset with hazelnut and fig trees, terracotta earth, a wooden crate of fresh figs and pomegranates in the foreground, Mediterranean haze over distant sea. Style: editorial food &amp; origin photography, photorealistic, natural warm light, muted palette of ivory, soil brown, pomegranate burgundy, apricot orange and leaf green with subtle gold accents, shallow depth of field, 35mm lens, premium brand-site quality, no text, no logos, no watermark. Aspect ratio 16:10. Avoid: text, letters, logo, watermark, cartoon, illustration, oversaturated, HDR, plastic look, extra fingers, deformed fruit, cluttered background.</w:t>
+            </w:r>
+          </w:p>
+        </w:tc>
+      </w:tr>
+      <w:tr>
+        <w:tc>
+          <w:tcPr>
+            <w:tcW w:type="dxa" w:w="1701"/>
+            <w:shd w:val="clear" w:color="auto" w:fill="F3EAD3"/>
+          </w:tcPr>
+          <w:p>
+            <w:r/>
+            <w:r>
+              <w:rPr>
+                <w:rFonts w:ascii="Pretendard" w:hAnsi="Pretendard" w:eastAsia="Pretendard"/>
+                <w:b/>
+                <w:i w:val="0"/>
+                <w:color w:val="111111"/>
+                <w:sz w:val="18"/>
+              </w:rPr>
               <w:t>네거티브</w:t>
             </w:r>
           </w:p>
@@ -4129,7 +5363,7 @@
                 <w:color w:val="111111"/>
                 <w:sz w:val="18"/>
               </w:rPr>
-              <w:t>투명 배경 원물 컷. 기존 석류·사과·체리 PNG와 동일한 스타일.</w:t>
+              <w:t>투명 배경 원물 컷. 기존 석류·사과·체리 PNG와 동일한 스타일. 그림자·후광 없이 생성 후 누끼.</w:t>
             </w:r>
           </w:p>
         </w:tc>
@@ -4247,6 +5481,45 @@
                 <w:sz w:val="18"/>
               </w:rPr>
               <w:t>/imagine Studio product shot of three ripe apricots with one halved showing the stone, on pure white background, soft top light, crisp detail, isolated for cut-out, matching a clean catalog fruit style, editorial food &amp; origin photography, photorealistic, natural warm light, muted palette of ivory, soil brown, pomegranate burgundy, apricot orange and leaf green with subtle gold accents, shallow depth of field, 35mm lens, premium brand-site quality, no text, no logos, no watermark --ar 1:1 --style raw --v 7 --no text letters logo watermark cartoon illustration oversaturated HDR plastic look extra fingers deformed fruit cluttered background</w:t>
+            </w:r>
+          </w:p>
+        </w:tc>
+      </w:tr>
+      <w:tr>
+        <w:tc>
+          <w:tcPr>
+            <w:tcW w:type="dxa" w:w="1701"/>
+            <w:shd w:val="clear" w:color="auto" w:fill="F3EAD3"/>
+          </w:tcPr>
+          <w:p>
+            <w:r/>
+            <w:r>
+              <w:rPr>
+                <w:rFonts w:ascii="Pretendard" w:hAnsi="Pretendard" w:eastAsia="Pretendard"/>
+                <w:b/>
+                <w:i w:val="0"/>
+                <w:color w:val="111111"/>
+                <w:sz w:val="18"/>
+              </w:rPr>
+              <w:t>Nano Banana / Flux</w:t>
+            </w:r>
+          </w:p>
+        </w:tc>
+        <w:tc>
+          <w:tcPr>
+            <w:tcW w:type="dxa" w:w="7937"/>
+          </w:tcPr>
+          <w:p>
+            <w:r/>
+            <w:r>
+              <w:rPr>
+                <w:rFonts w:ascii="Pretendard" w:hAnsi="Pretendard" w:eastAsia="Pretendard"/>
+                <w:b w:val="0"/>
+                <w:i w:val="0"/>
+                <w:color w:val="111111"/>
+                <w:sz w:val="18"/>
+              </w:rPr>
+              <w:t>Studio product shot of three ripe apricots with one halved showing the stone, on pure white background, soft top light, crisp detail, isolated for cut-out, matching a clean catalog fruit style. Style: editorial food &amp; origin photography, photorealistic, natural warm light, muted palette of ivory, soil brown, pomegranate burgundy, apricot orange and leaf green with subtle gold accents, shallow depth of field, 35mm lens, premium brand-site quality, no text, no logos, no watermark. Aspect ratio 1:1. Avoid: text, letters, logo, watermark, cartoon, illustration, oversaturated, HDR, plastic look, extra fingers, deformed fruit, cluttered background.</w:t>
             </w:r>
           </w:p>
         </w:tc>
@@ -4574,6 +5847,45 @@
                 <w:color w:val="111111"/>
                 <w:sz w:val="18"/>
               </w:rPr>
+              <w:t>Nano Banana / Flux</w:t>
+            </w:r>
+          </w:p>
+        </w:tc>
+        <w:tc>
+          <w:tcPr>
+            <w:tcW w:type="dxa" w:w="7937"/>
+          </w:tcPr>
+          <w:p>
+            <w:r/>
+            <w:r>
+              <w:rPr>
+                <w:rFonts w:ascii="Pretendard" w:hAnsi="Pretendard" w:eastAsia="Pretendard"/>
+                <w:b w:val="0"/>
+                <w:i w:val="0"/>
+                <w:color w:val="111111"/>
+                <w:sz w:val="18"/>
+              </w:rPr>
+              <w:t>Studio shot of a small scattered pile of almonds, pistachios, sunflower seeds and walnuts on pure white background, soft shadow, isolated cut-out style. Style: editorial food &amp; origin photography, photorealistic, natural warm light, muted palette of ivory, soil brown, pomegranate burgundy, apricot orange and leaf green with subtle gold accents, shallow depth of field, 35mm lens, premium brand-site quality, no text, no logos, no watermark. Aspect ratio 1:1. Avoid: text, letters, logo, watermark, cartoon, illustration, oversaturated, HDR, plastic look, extra fingers, deformed fruit, cluttered background.</w:t>
+            </w:r>
+          </w:p>
+        </w:tc>
+      </w:tr>
+      <w:tr>
+        <w:tc>
+          <w:tcPr>
+            <w:tcW w:type="dxa" w:w="1701"/>
+            <w:shd w:val="clear" w:color="auto" w:fill="F3EAD3"/>
+          </w:tcPr>
+          <w:p>
+            <w:r/>
+            <w:r>
+              <w:rPr>
+                <w:rFonts w:ascii="Pretendard" w:hAnsi="Pretendard" w:eastAsia="Pretendard"/>
+                <w:b/>
+                <w:i w:val="0"/>
+                <w:color w:val="111111"/>
+                <w:sz w:val="18"/>
+              </w:rPr>
               <w:t>네거티브</w:t>
             </w:r>
           </w:p>
@@ -4881,6 +6193,45 @@
                 <w:color w:val="111111"/>
                 <w:sz w:val="18"/>
               </w:rPr>
+              <w:t>Nano Banana / Flux</w:t>
+            </w:r>
+          </w:p>
+        </w:tc>
+        <w:tc>
+          <w:tcPr>
+            <w:tcW w:type="dxa" w:w="7937"/>
+          </w:tcPr>
+          <w:p>
+            <w:r/>
+            <w:r>
+              <w:rPr>
+                <w:rFonts w:ascii="Pretendard" w:hAnsi="Pretendard" w:eastAsia="Pretendard"/>
+                <w:b w:val="0"/>
+                <w:i w:val="0"/>
+                <w:color w:val="111111"/>
+                <w:sz w:val="18"/>
+              </w:rPr>
+              <w:t>Studio shot of a dark purple grape cluster with two glossy dates beside it on pure white background, dewy skin, isolated cut-out style. Style: editorial food &amp; origin photography, photorealistic, natural warm light, muted palette of ivory, soil brown, pomegranate burgundy, apricot orange and leaf green with subtle gold accents, shallow depth of field, 35mm lens, premium brand-site quality, no text, no logos, no watermark. Aspect ratio 1:1. Avoid: text, letters, logo, watermark, cartoon, illustration, oversaturated, HDR, plastic look, extra fingers, deformed fruit, cluttered background.</w:t>
+            </w:r>
+          </w:p>
+        </w:tc>
+      </w:tr>
+      <w:tr>
+        <w:tc>
+          <w:tcPr>
+            <w:tcW w:type="dxa" w:w="1701"/>
+            <w:shd w:val="clear" w:color="auto" w:fill="F3EAD3"/>
+          </w:tcPr>
+          <w:p>
+            <w:r/>
+            <w:r>
+              <w:rPr>
+                <w:rFonts w:ascii="Pretendard" w:hAnsi="Pretendard" w:eastAsia="Pretendard"/>
+                <w:b/>
+                <w:i w:val="0"/>
+                <w:color w:val="111111"/>
+                <w:sz w:val="18"/>
+              </w:rPr>
               <w:t>네거티브</w:t>
             </w:r>
           </w:p>
@@ -5188,6 +6539,45 @@
                 <w:color w:val="111111"/>
                 <w:sz w:val="18"/>
               </w:rPr>
+              <w:t>Nano Banana / Flux</w:t>
+            </w:r>
+          </w:p>
+        </w:tc>
+        <w:tc>
+          <w:tcPr>
+            <w:tcW w:type="dxa" w:w="7937"/>
+          </w:tcPr>
+          <w:p>
+            <w:r/>
+            <w:r>
+              <w:rPr>
+                <w:rFonts w:ascii="Pretendard" w:hAnsi="Pretendard" w:eastAsia="Pretendard"/>
+                <w:b w:val="0"/>
+                <w:i w:val="0"/>
+                <w:color w:val="111111"/>
+                <w:sz w:val="18"/>
+              </w:rPr>
+              <w:t>Overhead flat-lay of fruit processing by-products arranged like a design palette: dried pomegranate peels, apple pomace, cherry pits, apricot kernels, walnut shells, each in a small ceramic dish on dark slate, moody low-key lighting with a single warm gold rim light. Style: editorial food &amp; origin photography, photorealistic, natural warm light, muted palette of ivory, soil brown, pomegranate burgundy, apricot orange and leaf green with subtle gold accents, shallow depth of field, 35mm lens, premium brand-site quality, no text, no logos, no watermark. Aspect ratio 16:9. Avoid: text, letters, logo, watermark, cartoon, illustration, oversaturated, HDR, plastic look, extra fingers, deformed fruit, cluttered background.</w:t>
+            </w:r>
+          </w:p>
+        </w:tc>
+      </w:tr>
+      <w:tr>
+        <w:tc>
+          <w:tcPr>
+            <w:tcW w:type="dxa" w:w="1701"/>
+            <w:shd w:val="clear" w:color="auto" w:fill="F3EAD3"/>
+          </w:tcPr>
+          <w:p>
+            <w:r/>
+            <w:r>
+              <w:rPr>
+                <w:rFonts w:ascii="Pretendard" w:hAnsi="Pretendard" w:eastAsia="Pretendard"/>
+                <w:b/>
+                <w:i w:val="0"/>
+                <w:color w:val="111111"/>
+                <w:sz w:val="18"/>
+              </w:rPr>
               <w:t>네거티브</w:t>
             </w:r>
           </w:p>
@@ -5495,6 +6885,45 @@
                 <w:color w:val="111111"/>
                 <w:sz w:val="18"/>
               </w:rPr>
+              <w:t>Nano Banana / Flux</w:t>
+            </w:r>
+          </w:p>
+        </w:tc>
+        <w:tc>
+          <w:tcPr>
+            <w:tcW w:type="dxa" w:w="7937"/>
+          </w:tcPr>
+          <w:p>
+            <w:r/>
+            <w:r>
+              <w:rPr>
+                <w:rFonts w:ascii="Pretendard" w:hAnsi="Pretendard" w:eastAsia="Pretendard"/>
+                <w:b w:val="0"/>
+                <w:i w:val="0"/>
+                <w:color w:val="111111"/>
+                <w:sz w:val="18"/>
+              </w:rPr>
+              <w:t>Fine fruit powders in pomegranate red, apricot orange and cherry burgundy in three glass jars next to a tall glass of a creamy smoothie on an ivory linen surface, bright airy morning light. Style: editorial food &amp; origin photography, photorealistic, natural warm light, muted palette of ivory, soil brown, pomegranate burgundy, apricot orange and leaf green with subtle gold accents, shallow depth of field, 35mm lens, premium brand-site quality, no text, no logos, no watermark. Aspect ratio 4:3. Avoid: text, letters, logo, watermark, cartoon, illustration, oversaturated, HDR, plastic look, extra fingers, deformed fruit, cluttered background.</w:t>
+            </w:r>
+          </w:p>
+        </w:tc>
+      </w:tr>
+      <w:tr>
+        <w:tc>
+          <w:tcPr>
+            <w:tcW w:type="dxa" w:w="1701"/>
+            <w:shd w:val="clear" w:color="auto" w:fill="F3EAD3"/>
+          </w:tcPr>
+          <w:p>
+            <w:r/>
+            <w:r>
+              <w:rPr>
+                <w:rFonts w:ascii="Pretendard" w:hAnsi="Pretendard" w:eastAsia="Pretendard"/>
+                <w:b/>
+                <w:i w:val="0"/>
+                <w:color w:val="111111"/>
+                <w:sz w:val="18"/>
+              </w:rPr>
               <w:t>네거티브</w:t>
             </w:r>
           </w:p>
@@ -5802,6 +7231,45 @@
                 <w:color w:val="111111"/>
                 <w:sz w:val="18"/>
               </w:rPr>
+              <w:t>Nano Banana / Flux</w:t>
+            </w:r>
+          </w:p>
+        </w:tc>
+        <w:tc>
+          <w:tcPr>
+            <w:tcW w:type="dxa" w:w="7937"/>
+          </w:tcPr>
+          <w:p>
+            <w:r/>
+            <w:r>
+              <w:rPr>
+                <w:rFonts w:ascii="Pretendard" w:hAnsi="Pretendard" w:eastAsia="Pretendard"/>
+                <w:b w:val="0"/>
+                <w:i w:val="0"/>
+                <w:color w:val="111111"/>
+                <w:sz w:val="18"/>
+              </w:rPr>
+              <w:t>Cosmetic still life: a small amber dropper bottle of pomegranate peel extract, a shallow bowl of fine rose-brown scrub powder, dried peel fragments, on warm ivory stone, soft diffused light, spa-like calm. Style: editorial food &amp; origin photography, photorealistic, natural warm light, muted palette of ivory, soil brown, pomegranate burgundy, apricot orange and leaf green with subtle gold accents, shallow depth of field, 35mm lens, premium brand-site quality, no text, no logos, no watermark. Aspect ratio 4:3. Avoid: text, letters, logo, watermark, cartoon, illustration, oversaturated, HDR, plastic look, extra fingers, deformed fruit, cluttered background.</w:t>
+            </w:r>
+          </w:p>
+        </w:tc>
+      </w:tr>
+      <w:tr>
+        <w:tc>
+          <w:tcPr>
+            <w:tcW w:type="dxa" w:w="1701"/>
+            <w:shd w:val="clear" w:color="auto" w:fill="F3EAD3"/>
+          </w:tcPr>
+          <w:p>
+            <w:r/>
+            <w:r>
+              <w:rPr>
+                <w:rFonts w:ascii="Pretendard" w:hAnsi="Pretendard" w:eastAsia="Pretendard"/>
+                <w:b/>
+                <w:i w:val="0"/>
+                <w:color w:val="111111"/>
+                <w:sz w:val="18"/>
+              </w:rPr>
               <w:t>네거티브</w:t>
             </w:r>
           </w:p>
@@ -6109,6 +7577,45 @@
                 <w:color w:val="111111"/>
                 <w:sz w:val="18"/>
               </w:rPr>
+              <w:t>Nano Banana / Flux</w:t>
+            </w:r>
+          </w:p>
+        </w:tc>
+        <w:tc>
+          <w:tcPr>
+            <w:tcW w:type="dxa" w:w="7937"/>
+          </w:tcPr>
+          <w:p>
+            <w:r/>
+            <w:r>
+              <w:rPr>
+                <w:rFonts w:ascii="Pretendard" w:hAnsi="Pretendard" w:eastAsia="Pretendard"/>
+                <w:b w:val="0"/>
+                <w:i w:val="0"/>
+                <w:color w:val="111111"/>
+                <w:sz w:val="18"/>
+              </w:rPr>
+              <w:t>Neatly graded piles of walnut shell granules from coarse to fine on a lab bench, a stainless sieve, a labeled kraft sample bag (blank label), neutral warm grey light, industrial-clean. Style: editorial food &amp; origin photography, photorealistic, natural warm light, muted palette of ivory, soil brown, pomegranate burgundy, apricot orange and leaf green with subtle gold accents, shallow depth of field, 35mm lens, premium brand-site quality, no text, no logos, no watermark. Aspect ratio 4:3. Avoid: text, letters, logo, watermark, cartoon, illustration, oversaturated, HDR, plastic look, extra fingers, deformed fruit, cluttered background.</w:t>
+            </w:r>
+          </w:p>
+        </w:tc>
+      </w:tr>
+      <w:tr>
+        <w:tc>
+          <w:tcPr>
+            <w:tcW w:type="dxa" w:w="1701"/>
+            <w:shd w:val="clear" w:color="auto" w:fill="F3EAD3"/>
+          </w:tcPr>
+          <w:p>
+            <w:r/>
+            <w:r>
+              <w:rPr>
+                <w:rFonts w:ascii="Pretendard" w:hAnsi="Pretendard" w:eastAsia="Pretendard"/>
+                <w:b/>
+                <w:i w:val="0"/>
+                <w:color w:val="111111"/>
+                <w:sz w:val="18"/>
+              </w:rPr>
               <w:t>네거티브</w:t>
             </w:r>
           </w:p>
@@ -6416,6 +7923,45 @@
                 <w:color w:val="111111"/>
                 <w:sz w:val="18"/>
               </w:rPr>
+              <w:t>Nano Banana / Flux</w:t>
+            </w:r>
+          </w:p>
+        </w:tc>
+        <w:tc>
+          <w:tcPr>
+            <w:tcW w:type="dxa" w:w="7937"/>
+          </w:tcPr>
+          <w:p>
+            <w:r/>
+            <w:r>
+              <w:rPr>
+                <w:rFonts w:ascii="Pretendard" w:hAnsi="Pretendard" w:eastAsia="Pretendard"/>
+                <w:b w:val="0"/>
+                <w:i w:val="0"/>
+                <w:color w:val="111111"/>
+                <w:sz w:val="18"/>
+              </w:rPr>
+              <w:t>Laboratory scene with a glass beaker of deep ruby pomegranate peel extract under warm light, dried peel powder on a watch glass, pipette, dark burgundy backdrop, elegant and scientific. Style: editorial food &amp; origin photography, photorealistic, natural warm light, muted palette of ivory, soil brown, pomegranate burgundy, apricot orange and leaf green with subtle gold accents, shallow depth of field, 35mm lens, premium brand-site quality, no text, no logos, no watermark. Aspect ratio 4:3. Avoid: text, letters, logo, watermark, cartoon, illustration, oversaturated, HDR, plastic look, extra fingers, deformed fruit, cluttered background.</w:t>
+            </w:r>
+          </w:p>
+        </w:tc>
+      </w:tr>
+      <w:tr>
+        <w:tc>
+          <w:tcPr>
+            <w:tcW w:type="dxa" w:w="1701"/>
+            <w:shd w:val="clear" w:color="auto" w:fill="F3EAD3"/>
+          </w:tcPr>
+          <w:p>
+            <w:r/>
+            <w:r>
+              <w:rPr>
+                <w:rFonts w:ascii="Pretendard" w:hAnsi="Pretendard" w:eastAsia="Pretendard"/>
+                <w:b/>
+                <w:i w:val="0"/>
+                <w:color w:val="111111"/>
+                <w:sz w:val="18"/>
+              </w:rPr>
               <w:t>네거티브</w:t>
             </w:r>
           </w:p>
@@ -6723,6 +8269,45 @@
                 <w:color w:val="111111"/>
                 <w:sz w:val="18"/>
               </w:rPr>
+              <w:t>Nano Banana / Flux</w:t>
+            </w:r>
+          </w:p>
+        </w:tc>
+        <w:tc>
+          <w:tcPr>
+            <w:tcW w:type="dxa" w:w="7937"/>
+          </w:tcPr>
+          <w:p>
+            <w:r/>
+            <w:r>
+              <w:rPr>
+                <w:rFonts w:ascii="Pretendard" w:hAnsi="Pretendard" w:eastAsia="Pretendard"/>
+                <w:b w:val="0"/>
+                <w:i w:val="0"/>
+                <w:color w:val="111111"/>
+                <w:sz w:val="18"/>
+              </w:rPr>
+              <w:t>Test kitchen scene: fruit powder being whisked into a glass of milk, powders in small bowls, a notebook with blank pages, bright ivory and apricot tones, clean and appetizing. Style: editorial food &amp; origin photography, photorealistic, natural warm light, muted palette of ivory, soil brown, pomegranate burgundy, apricot orange and leaf green with subtle gold accents, shallow depth of field, 35mm lens, premium brand-site quality, no text, no logos, no watermark. Aspect ratio 4:3. Avoid: text, letters, logo, watermark, cartoon, illustration, oversaturated, HDR, plastic look, extra fingers, deformed fruit, cluttered background.</w:t>
+            </w:r>
+          </w:p>
+        </w:tc>
+      </w:tr>
+      <w:tr>
+        <w:tc>
+          <w:tcPr>
+            <w:tcW w:type="dxa" w:w="1701"/>
+            <w:shd w:val="clear" w:color="auto" w:fill="F3EAD3"/>
+          </w:tcPr>
+          <w:p>
+            <w:r/>
+            <w:r>
+              <w:rPr>
+                <w:rFonts w:ascii="Pretendard" w:hAnsi="Pretendard" w:eastAsia="Pretendard"/>
+                <w:b/>
+                <w:i w:val="0"/>
+                <w:color w:val="111111"/>
+                <w:sz w:val="18"/>
+              </w:rPr>
               <w:t>네거티브</w:t>
             </w:r>
           </w:p>
@@ -7030,6 +8615,45 @@
                 <w:color w:val="111111"/>
                 <w:sz w:val="18"/>
               </w:rPr>
+              <w:t>Nano Banana / Flux</w:t>
+            </w:r>
+          </w:p>
+        </w:tc>
+        <w:tc>
+          <w:tcPr>
+            <w:tcW w:type="dxa" w:w="7937"/>
+          </w:tcPr>
+          <w:p>
+            <w:r/>
+            <w:r>
+              <w:rPr>
+                <w:rFonts w:ascii="Pretendard" w:hAnsi="Pretendard" w:eastAsia="Pretendard"/>
+                <w:b w:val="0"/>
+                <w:i w:val="0"/>
+                <w:color w:val="111111"/>
+                <w:sz w:val="18"/>
+              </w:rPr>
+              <w:t>Macro of walnut shell abrasive granules pouring from a scoop into a metal tray, golden-brown texture, dark charcoal background, single warm key light, industrial elegance. Style: editorial food &amp; origin photography, photorealistic, natural warm light, muted palette of ivory, soil brown, pomegranate burgundy, apricot orange and leaf green with subtle gold accents, shallow depth of field, 35mm lens, premium brand-site quality, no text, no logos, no watermark. Aspect ratio 4:3. Avoid: text, letters, logo, watermark, cartoon, illustration, oversaturated, HDR, plastic look, extra fingers, deformed fruit, cluttered background.</w:t>
+            </w:r>
+          </w:p>
+        </w:tc>
+      </w:tr>
+      <w:tr>
+        <w:tc>
+          <w:tcPr>
+            <w:tcW w:type="dxa" w:w="1701"/>
+            <w:shd w:val="clear" w:color="auto" w:fill="F3EAD3"/>
+          </w:tcPr>
+          <w:p>
+            <w:r/>
+            <w:r>
+              <w:rPr>
+                <w:rFonts w:ascii="Pretendard" w:hAnsi="Pretendard" w:eastAsia="Pretendard"/>
+                <w:b/>
+                <w:i w:val="0"/>
+                <w:color w:val="111111"/>
+                <w:sz w:val="18"/>
+              </w:rPr>
               <w:t>네거티브</w:t>
             </w:r>
           </w:p>
@@ -7121,7 +8745,7 @@
                 <w:color w:val="111111"/>
                 <w:sz w:val="18"/>
               </w:rPr>
-              <w:t>홈 JOURNEY 04 MARKET</w:t>
+              <w:t>홈 JOURNEY 04 MARKET 카드 (홈 08 MARKET 섹션은 인터랙티브 세계지도로 이미 구현 — 이미지 불필요)</w:t>
             </w:r>
           </w:p>
         </w:tc>
@@ -7160,7 +8784,7 @@
                 <w:color w:val="111111"/>
                 <w:sz w:val="18"/>
               </w:rPr>
-              <w:t>16:9 / 4:3</w:t>
+              <w:t>4:3</w:t>
             </w:r>
           </w:p>
         </w:tc>
@@ -7199,7 +8823,7 @@
                 <w:color w:val="111111"/>
                 <w:sz w:val="18"/>
               </w:rPr>
-              <w:t>아시아 유통·물류 네트워크. 추상적·미니멀 다크 톤.</w:t>
+              <w:t>아시아·태평양 12개국 공동진출 네트워크의 감성 컷. 사이트 지도와 같은 색 체계(차콜 #111 바탕 · 골드 #B49141 판권국 · 버건디 원산지)로 통일.</w:t>
             </w:r>
           </w:p>
         </w:tc>
@@ -7238,7 +8862,7 @@
                 <w:color w:val="111111"/>
                 <w:sz w:val="18"/>
               </w:rPr>
-              <w:t>Minimal dark navy world-map style visual of Central Asia to East Asia with glowing gold route lines connecting Tashkent, Istanbul, Incheon and Southeast Asian ports, subtle topographic texture, premium fintech-like aesthetic, no labels, editorial food &amp; origin photography, photorealistic, natural warm light, muted palette of ivory, soil brown, pomegranate burgundy, apricot orange and leaf green with subtle gold accents, shallow depth of field, 35mm lens, premium brand-site quality, no text, no logos, no watermark</w:t>
+              <w:t>Minimal near-black (#111111) stylized map of Asia-Pacific from Türkiye and Uzbekistan to Korea, Japan, Southeast Asia and Australia, softly glowing gold (#B49141) arc routes curving upward from two burgundy origin points to a bright hub on the Korean peninsula and fanning out to twelve markets, fine dotted graticule, subtle paper grain, premium editorial infographic mood, no labels, no country names, editorial food &amp; origin photography, photorealistic, natural warm light, muted palette of ivory, soil brown, pomegranate burgundy, apricot orange and leaf green with subtle gold accents, shallow depth of field, 35mm lens, premium brand-site quality, no text, no logos, no watermark</w:t>
             </w:r>
           </w:p>
         </w:tc>
@@ -7277,7 +8901,7 @@
                 <w:color w:val="111111"/>
                 <w:sz w:val="18"/>
               </w:rPr>
-              <w:t>중앙아시아에서 동아시아까지를 담은 미니멀 다크 네이비 지도형 비주얼, 타슈켄트·이스탄불·인천·동남아 항구를 잇는 빛나는 골드 라인, 은은한 지형 질감, 프리미엄 핀테크 느낌, 라벨 없음. 에디토리얼 푸드·원산지 사진, 실사, 자연스러운 따뜻한 빛, 아이보리·소일브라운·석류 버건디·살구 오렌지·리프 그린의 저채도 팔레트에 은은한 골드 포인트, 얕은 심도, 35mm, 프리미엄 브랜드 사이트 품질, 글자·로고 없음</w:t>
+              <w:t>튀르키예·우즈베키스탄에서 한국·일본·동남아·호주까지 아우르는 거의 검정(#111) 톤의 미니멀 아시아·태평양 지도, 버건디 원산지 두 점에서 한반도의 밝은 거점으로 위로 휘어 올라가는 은은한 골드(#B49141) 아크 경로, 거점에서 12개 시장으로 퍼지는 라인, 가는 점선 경위선, 은은한 종이 질감, 프리미엄 에디토리얼 인포그래픽 무드, 라벨·국가명 없음. 에디토리얼 푸드·원산지 사진, 실사, 자연스러운 따뜻한 빛, 아이보리·소일브라운·석류 버건디·살구 오렌지·리프 그린의 저채도 팔레트에 은은한 골드 포인트, 얕은 심도, 35mm, 프리미엄 브랜드 사이트 품질, 글자·로고 없음</w:t>
             </w:r>
           </w:p>
         </w:tc>
@@ -7316,7 +8940,46 @@
                 <w:color w:val="111111"/>
                 <w:sz w:val="18"/>
               </w:rPr>
-              <w:t>/imagine Minimal dark navy world-map style visual of Central Asia to East Asia with glowing gold route lines connecting Tashkent, Istanbul, Incheon and Southeast Asian ports, subtle topographic texture, premium fintech-like aesthetic, no labels, editorial food &amp; origin photography, photorealistic, natural warm light, muted palette of ivory, soil brown, pomegranate burgundy, apricot orange and leaf green with subtle gold accents, shallow depth of field, 35mm lens, premium brand-site quality, no text, no logos, no watermark --ar 16:9 --style raw --v 7 --no text letters logo watermark cartoon illustration oversaturated HDR plastic look extra fingers deformed fruit cluttered background</w:t>
+              <w:t>/imagine Minimal near-black (#111111) stylized map of Asia-Pacific from Türkiye and Uzbekistan to Korea, Japan, Southeast Asia and Australia, softly glowing gold (#B49141) arc routes curving upward from two burgundy origin points to a bright hub on the Korean peninsula and fanning out to twelve markets, fine dotted graticule, subtle paper grain, premium editorial infographic mood, no labels, no country names, editorial food &amp; origin photography, photorealistic, natural warm light, muted palette of ivory, soil brown, pomegranate burgundy, apricot orange and leaf green with subtle gold accents, shallow depth of field, 35mm lens, premium brand-site quality, no text, no logos, no watermark --ar 4:3 --style raw --v 7 --no text letters logo watermark cartoon illustration oversaturated HDR plastic look extra fingers deformed fruit cluttered background</w:t>
+            </w:r>
+          </w:p>
+        </w:tc>
+      </w:tr>
+      <w:tr>
+        <w:tc>
+          <w:tcPr>
+            <w:tcW w:type="dxa" w:w="1701"/>
+            <w:shd w:val="clear" w:color="auto" w:fill="F3EAD3"/>
+          </w:tcPr>
+          <w:p>
+            <w:r/>
+            <w:r>
+              <w:rPr>
+                <w:rFonts w:ascii="Pretendard" w:hAnsi="Pretendard" w:eastAsia="Pretendard"/>
+                <w:b/>
+                <w:i w:val="0"/>
+                <w:color w:val="111111"/>
+                <w:sz w:val="18"/>
+              </w:rPr>
+              <w:t>Nano Banana / Flux</w:t>
+            </w:r>
+          </w:p>
+        </w:tc>
+        <w:tc>
+          <w:tcPr>
+            <w:tcW w:type="dxa" w:w="7937"/>
+          </w:tcPr>
+          <w:p>
+            <w:r/>
+            <w:r>
+              <w:rPr>
+                <w:rFonts w:ascii="Pretendard" w:hAnsi="Pretendard" w:eastAsia="Pretendard"/>
+                <w:b w:val="0"/>
+                <w:i w:val="0"/>
+                <w:color w:val="111111"/>
+                <w:sz w:val="18"/>
+              </w:rPr>
+              <w:t>Minimal near-black (#111111) stylized map of Asia-Pacific from Türkiye and Uzbekistan to Korea, Japan, Southeast Asia and Australia, softly glowing gold (#B49141) arc routes curving upward from two burgundy origin points to a bright hub on the Korean peninsula and fanning out to twelve markets, fine dotted graticule, subtle paper grain, premium editorial infographic mood, no labels, no country names. Style: editorial food &amp; origin photography, photorealistic, natural warm light, muted palette of ivory, soil brown, pomegranate burgundy, apricot orange and leaf green with subtle gold accents, shallow depth of field, 35mm lens, premium brand-site quality, no text, no logos, no watermark. Aspect ratio 4:3. Avoid: text, letters, logo, watermark, cartoon, illustration, oversaturated, HDR, plastic look, extra fingers, deformed fruit, cluttered background.</w:t>
             </w:r>
           </w:p>
         </w:tc>
@@ -7428,7 +9091,7 @@
                 <w:color w:val="111111"/>
                 <w:sz w:val="18"/>
               </w:rPr>
-              <w:t>SOLKERN 페이지 PARTNERS 섹션</w:t>
+              <w:t>SOLKERN 페이지 PARTNERS 섹션 ('생산에서 판매까지, 3사 협력 구조')</w:t>
             </w:r>
           </w:p>
         </w:tc>
@@ -7506,7 +9169,7 @@
                 <w:color w:val="111111"/>
                 <w:sz w:val="18"/>
               </w:rPr>
-              <w:t>3사 협력의 신뢰감. 실제 팀 사진으로 교체 권장.</w:t>
+              <w:t>ZAFARXON·ERMÁK(생산) × CATKIN(수입·통관) × SOLKERN(판매·R&amp;D) — 'ERMÁK 아시아 공동진출 공식파트너' 관계의 신뢰감. 실제 3사 미팅 사진으로 교체 강력 권장.</w:t>
             </w:r>
           </w:p>
         </w:tc>
@@ -7545,7 +9208,7 @@
                 <w:color w:val="111111"/>
                 <w:sz w:val="18"/>
               </w:rPr>
-              <w:t>Business partners from Korea and Uzbekistan shaking hands over a table with fruit samples, jars and documents, warm office light, candid documentary feel, faces softly out of focus, editorial food &amp; origin photography, photorealistic, natural warm light, muted palette of ivory, soil brown, pomegranate burgundy, apricot orange and leaf green with subtle gold accents, shallow depth of field, 35mm lens, premium brand-site quality, no text, no logos, no watermark</w:t>
+              <w:t>Three business partners from Korea and Uzbekistan around a wooden table with ERMÁK-style jars, juice bottles, fruit samples and a signed folder, one handshake in the center, warm office light, candid documentary feel, faces softly out of focus, no readable text, editorial food &amp; origin photography, photorealistic, natural warm light, muted palette of ivory, soil brown, pomegranate burgundy, apricot orange and leaf green with subtle gold accents, shallow depth of field, 35mm lens, premium brand-site quality, no text, no logos, no watermark</w:t>
             </w:r>
           </w:p>
         </w:tc>
@@ -7623,7 +9286,46 @@
                 <w:color w:val="111111"/>
                 <w:sz w:val="18"/>
               </w:rPr>
-              <w:t>/imagine Business partners from Korea and Uzbekistan shaking hands over a table with fruit samples, jars and documents, warm office light, candid documentary feel, faces softly out of focus, editorial food &amp; origin photography, photorealistic, natural warm light, muted palette of ivory, soil brown, pomegranate burgundy, apricot orange and leaf green with subtle gold accents, shallow depth of field, 35mm lens, premium brand-site quality, no text, no logos, no watermark --ar 4:3 --style raw --v 7 --no text letters logo watermark cartoon illustration oversaturated HDR plastic look extra fingers deformed fruit cluttered background</w:t>
+              <w:t>/imagine Three business partners from Korea and Uzbekistan around a wooden table with ERMÁK-style jars, juice bottles, fruit samples and a signed folder, one handshake in the center, warm office light, candid documentary feel, faces softly out of focus, no readable text, editorial food &amp; origin photography, photorealistic, natural warm light, muted palette of ivory, soil brown, pomegranate burgundy, apricot orange and leaf green with subtle gold accents, shallow depth of field, 35mm lens, premium brand-site quality, no text, no logos, no watermark --ar 4:3 --style raw --v 7 --no text letters logo watermark cartoon illustration oversaturated HDR plastic look extra fingers deformed fruit cluttered background</w:t>
+            </w:r>
+          </w:p>
+        </w:tc>
+      </w:tr>
+      <w:tr>
+        <w:tc>
+          <w:tcPr>
+            <w:tcW w:type="dxa" w:w="1701"/>
+            <w:shd w:val="clear" w:color="auto" w:fill="F3EAD3"/>
+          </w:tcPr>
+          <w:p>
+            <w:r/>
+            <w:r>
+              <w:rPr>
+                <w:rFonts w:ascii="Pretendard" w:hAnsi="Pretendard" w:eastAsia="Pretendard"/>
+                <w:b/>
+                <w:i w:val="0"/>
+                <w:color w:val="111111"/>
+                <w:sz w:val="18"/>
+              </w:rPr>
+              <w:t>Nano Banana / Flux</w:t>
+            </w:r>
+          </w:p>
+        </w:tc>
+        <w:tc>
+          <w:tcPr>
+            <w:tcW w:type="dxa" w:w="7937"/>
+          </w:tcPr>
+          <w:p>
+            <w:r/>
+            <w:r>
+              <w:rPr>
+                <w:rFonts w:ascii="Pretendard" w:hAnsi="Pretendard" w:eastAsia="Pretendard"/>
+                <w:b w:val="0"/>
+                <w:i w:val="0"/>
+                <w:color w:val="111111"/>
+                <w:sz w:val="18"/>
+              </w:rPr>
+              <w:t>Three business partners from Korea and Uzbekistan around a wooden table with ERMÁK-style jars, juice bottles, fruit samples and a signed folder, one handshake in the center, warm office light, candid documentary feel, faces softly out of focus, no readable text. Style: editorial food &amp; origin photography, photorealistic, natural warm light, muted palette of ivory, soil brown, pomegranate burgundy, apricot orange and leaf green with subtle gold accents, shallow depth of field, 35mm lens, premium brand-site quality, no text, no logos, no watermark. Aspect ratio 4:3. Avoid: text, letters, logo, watermark, cartoon, illustration, oversaturated, HDR, plastic look, extra fingers, deformed fruit, cluttered background.</w:t>
             </w:r>
           </w:p>
         </w:tc>
@@ -7951,6 +9653,45 @@
                 <w:color w:val="111111"/>
                 <w:sz w:val="18"/>
               </w:rPr>
+              <w:t>Nano Banana / Flux</w:t>
+            </w:r>
+          </w:p>
+        </w:tc>
+        <w:tc>
+          <w:tcPr>
+            <w:tcW w:type="dxa" w:w="7937"/>
+          </w:tcPr>
+          <w:p>
+            <w:r/>
+            <w:r>
+              <w:rPr>
+                <w:rFonts w:ascii="Pretendard" w:hAnsi="Pretendard" w:eastAsia="Pretendard"/>
+                <w:b w:val="0"/>
+                <w:i w:val="0"/>
+                <w:color w:val="111111"/>
+                <w:sz w:val="18"/>
+              </w:rPr>
+              <w:t>Bright modern small office interior with a wooden meeting table, shelves displaying glass jars of jams and juice bottles, a framed map of Central Asia, morning light through large windows. Style: editorial food &amp; origin photography, photorealistic, natural warm light, muted palette of ivory, soil brown, pomegranate burgundy, apricot orange and leaf green with subtle gold accents, shallow depth of field, 35mm lens, premium brand-site quality, no text, no logos, no watermark. Aspect ratio 16:9. Avoid: text, letters, logo, watermark, cartoon, illustration, oversaturated, HDR, plastic look, extra fingers, deformed fruit, cluttered background.</w:t>
+            </w:r>
+          </w:p>
+        </w:tc>
+      </w:tr>
+      <w:tr>
+        <w:tc>
+          <w:tcPr>
+            <w:tcW w:type="dxa" w:w="1701"/>
+            <w:shd w:val="clear" w:color="auto" w:fill="F3EAD3"/>
+          </w:tcPr>
+          <w:p>
+            <w:r/>
+            <w:r>
+              <w:rPr>
+                <w:rFonts w:ascii="Pretendard" w:hAnsi="Pretendard" w:eastAsia="Pretendard"/>
+                <w:b/>
+                <w:i w:val="0"/>
+                <w:color w:val="111111"/>
+                <w:sz w:val="18"/>
+              </w:rPr>
               <w:t>네거티브</w:t>
             </w:r>
           </w:p>
@@ -8258,6 +9999,45 @@
                 <w:color w:val="111111"/>
                 <w:sz w:val="18"/>
               </w:rPr>
+              <w:t>Nano Banana / Flux</w:t>
+            </w:r>
+          </w:p>
+        </w:tc>
+        <w:tc>
+          <w:tcPr>
+            <w:tcW w:type="dxa" w:w="7937"/>
+          </w:tcPr>
+          <w:p>
+            <w:r/>
+            <w:r>
+              <w:rPr>
+                <w:rFonts w:ascii="Pretendard" w:hAnsi="Pretendard" w:eastAsia="Pretendard"/>
+                <w:b w:val="0"/>
+                <w:i w:val="0"/>
+                <w:color w:val="111111"/>
+                <w:sz w:val="18"/>
+              </w:rPr>
+              <w:t>Dark moody wide shot of a wooden desk with a pomegranate, a glass of juice and an open notebook, warm rim light, mostly deep charcoal negative space on the right for text overlay. Style: editorial food &amp; origin photography, photorealistic, natural warm light, muted palette of ivory, soil brown, pomegranate burgundy, apricot orange and leaf green with subtle gold accents, shallow depth of field, 35mm lens, premium brand-site quality, no text, no logos, no watermark. Aspect ratio 21:9. Avoid: text, letters, logo, watermark, cartoon, illustration, oversaturated, HDR, plastic look, extra fingers, deformed fruit, cluttered background.</w:t>
+            </w:r>
+          </w:p>
+        </w:tc>
+      </w:tr>
+      <w:tr>
+        <w:tc>
+          <w:tcPr>
+            <w:tcW w:type="dxa" w:w="1701"/>
+            <w:shd w:val="clear" w:color="auto" w:fill="F3EAD3"/>
+          </w:tcPr>
+          <w:p>
+            <w:r/>
+            <w:r>
+              <w:rPr>
+                <w:rFonts w:ascii="Pretendard" w:hAnsi="Pretendard" w:eastAsia="Pretendard"/>
+                <w:b/>
+                <w:i w:val="0"/>
+                <w:color w:val="111111"/>
+                <w:sz w:val="18"/>
+              </w:rPr>
               <w:t>네거티브</w:t>
             </w:r>
           </w:p>
@@ -8427,7 +10207,7 @@
                 <w:color w:val="111111"/>
                 <w:sz w:val="18"/>
               </w:rPr>
-              <w:t>실제 제품 컷 교체 권장(카탈로그 p.12).</w:t>
+              <w:t>실제 제품 컷 교체 권장(카탈로그 p.12). ERMÁK 제품 카드는 사이트가 스포트라이트·후광·바닥 반사를 자동으로 입히므로, 이미지 자체에는 그림자·빛번짐·후광이 없어야 함(완전 투명 배경).</w:t>
             </w:r>
           </w:p>
         </w:tc>
@@ -8466,7 +10246,7 @@
                 <w:color w:val="111111"/>
                 <w:sz w:val="18"/>
               </w:rPr>
-              <w:t>Three small glass jam jars in a row — dark cherry, bright apricot, golden quince — black lids, pure white background, isolated cut-out style, editorial food &amp; origin photography, photorealistic, natural warm light, muted palette of ivory, soil brown, pomegranate burgundy, apricot orange and leaf green with subtle gold accents, shallow depth of field, 35mm lens, premium brand-site quality, no text, no logos, no watermark</w:t>
+              <w:t>Three small glass jam jars in a row — dark cherry, bright apricot, golden quince — black lids, pure white seamless background, no cast shadow, no glow, no reflection, isolated cut-out style, editorial food &amp; origin photography, photorealistic, natural warm light, muted palette of ivory, soil brown, pomegranate burgundy, apricot orange and leaf green with subtle gold accents, shallow depth of field, 35mm lens, premium brand-site quality, no text, no logos, no watermark</w:t>
             </w:r>
           </w:p>
         </w:tc>
@@ -8544,7 +10324,46 @@
                 <w:color w:val="111111"/>
                 <w:sz w:val="18"/>
               </w:rPr>
-              <w:t>/imagine Three small glass jam jars in a row — dark cherry, bright apricot, golden quince — black lids, pure white background, isolated cut-out style, editorial food &amp; origin photography, photorealistic, natural warm light, muted palette of ivory, soil brown, pomegranate burgundy, apricot orange and leaf green with subtle gold accents, shallow depth of field, 35mm lens, premium brand-site quality, no text, no logos, no watermark --ar 1:1 --style raw --v 7 --no text letters logo watermark cartoon illustration oversaturated HDR plastic look extra fingers deformed fruit cluttered background</w:t>
+              <w:t>/imagine Three small glass jam jars in a row — dark cherry, bright apricot, golden quince — black lids, pure white seamless background, no cast shadow, no glow, no reflection, isolated cut-out style, editorial food &amp; origin photography, photorealistic, natural warm light, muted palette of ivory, soil brown, pomegranate burgundy, apricot orange and leaf green with subtle gold accents, shallow depth of field, 35mm lens, premium brand-site quality, no text, no logos, no watermark --ar 1:1 --style raw --v 7 --no text letters logo watermark cartoon illustration oversaturated HDR plastic look extra fingers deformed fruit cluttered background</w:t>
+            </w:r>
+          </w:p>
+        </w:tc>
+      </w:tr>
+      <w:tr>
+        <w:tc>
+          <w:tcPr>
+            <w:tcW w:type="dxa" w:w="1701"/>
+            <w:shd w:val="clear" w:color="auto" w:fill="F3EAD3"/>
+          </w:tcPr>
+          <w:p>
+            <w:r/>
+            <w:r>
+              <w:rPr>
+                <w:rFonts w:ascii="Pretendard" w:hAnsi="Pretendard" w:eastAsia="Pretendard"/>
+                <w:b/>
+                <w:i w:val="0"/>
+                <w:color w:val="111111"/>
+                <w:sz w:val="18"/>
+              </w:rPr>
+              <w:t>Nano Banana / Flux</w:t>
+            </w:r>
+          </w:p>
+        </w:tc>
+        <w:tc>
+          <w:tcPr>
+            <w:tcW w:type="dxa" w:w="7937"/>
+          </w:tcPr>
+          <w:p>
+            <w:r/>
+            <w:r>
+              <w:rPr>
+                <w:rFonts w:ascii="Pretendard" w:hAnsi="Pretendard" w:eastAsia="Pretendard"/>
+                <w:b w:val="0"/>
+                <w:i w:val="0"/>
+                <w:color w:val="111111"/>
+                <w:sz w:val="18"/>
+              </w:rPr>
+              <w:t>Three small glass jam jars in a row — dark cherry, bright apricot, golden quince — black lids, pure white seamless background, no cast shadow, no glow, no reflection, isolated cut-out style. Style: editorial food &amp; origin photography, photorealistic, natural warm light, muted palette of ivory, soil brown, pomegranate burgundy, apricot orange and leaf green with subtle gold accents, shallow depth of field, 35mm lens, premium brand-site quality, no text, no logos, no watermark. Aspect ratio 1:1. Avoid: text, letters, logo, watermark, cartoon, illustration, oversaturated, HDR, plastic look, extra fingers, deformed fruit, cluttered background.</w:t>
             </w:r>
           </w:p>
         </w:tc>
@@ -8734,7 +10553,7 @@
                 <w:color w:val="111111"/>
                 <w:sz w:val="18"/>
               </w:rPr>
-              <w:t>실제 제품 컷 교체 권장(카탈로그 KO p.16).</w:t>
+              <w:t>실제 제품 컷 교체 권장(카탈로그 KO p.16). 그림자·후광 없는 완전 투명 배경 누끼 필수(사이트 공통 조명 적용).</w:t>
             </w:r>
           </w:p>
         </w:tc>
@@ -8773,7 +10592,7 @@
                 <w:color w:val="111111"/>
                 <w:sz w:val="18"/>
               </w:rPr>
-              <w:t>Studio shot of three small glass jars of smooth fruit puree — apple, apricot, quince — with black lids, pure white background, isolated cut-out style, editorial food &amp; origin photography, photorealistic, natural warm light, muted palette of ivory, soil brown, pomegranate burgundy, apricot orange and leaf green with subtle gold accents, shallow depth of field, 35mm lens, premium brand-site quality, no text, no logos, no watermark</w:t>
+              <w:t>Studio shot of three small glass jars of smooth fruit puree — apple, apricot, quince — with black lids, pure white seamless background, no cast shadow, no glow, isolated cut-out style, editorial food &amp; origin photography, photorealistic, natural warm light, muted palette of ivory, soil brown, pomegranate burgundy, apricot orange and leaf green with subtle gold accents, shallow depth of field, 35mm lens, premium brand-site quality, no text, no logos, no watermark</w:t>
             </w:r>
           </w:p>
         </w:tc>
@@ -8851,7 +10670,46 @@
                 <w:color w:val="111111"/>
                 <w:sz w:val="18"/>
               </w:rPr>
-              <w:t>/imagine Studio shot of three small glass jars of smooth fruit puree — apple, apricot, quince — with black lids, pure white background, isolated cut-out style, editorial food &amp; origin photography, photorealistic, natural warm light, muted palette of ivory, soil brown, pomegranate burgundy, apricot orange and leaf green with subtle gold accents, shallow depth of field, 35mm lens, premium brand-site quality, no text, no logos, no watermark --ar 1:1 --style raw --v 7 --no text letters logo watermark cartoon illustration oversaturated HDR plastic look extra fingers deformed fruit cluttered background</w:t>
+              <w:t>/imagine Studio shot of three small glass jars of smooth fruit puree — apple, apricot, quince — with black lids, pure white seamless background, no cast shadow, no glow, isolated cut-out style, editorial food &amp; origin photography, photorealistic, natural warm light, muted palette of ivory, soil brown, pomegranate burgundy, apricot orange and leaf green with subtle gold accents, shallow depth of field, 35mm lens, premium brand-site quality, no text, no logos, no watermark --ar 1:1 --style raw --v 7 --no text letters logo watermark cartoon illustration oversaturated HDR plastic look extra fingers deformed fruit cluttered background</w:t>
+            </w:r>
+          </w:p>
+        </w:tc>
+      </w:tr>
+      <w:tr>
+        <w:tc>
+          <w:tcPr>
+            <w:tcW w:type="dxa" w:w="1701"/>
+            <w:shd w:val="clear" w:color="auto" w:fill="F3EAD3"/>
+          </w:tcPr>
+          <w:p>
+            <w:r/>
+            <w:r>
+              <w:rPr>
+                <w:rFonts w:ascii="Pretendard" w:hAnsi="Pretendard" w:eastAsia="Pretendard"/>
+                <w:b/>
+                <w:i w:val="0"/>
+                <w:color w:val="111111"/>
+                <w:sz w:val="18"/>
+              </w:rPr>
+              <w:t>Nano Banana / Flux</w:t>
+            </w:r>
+          </w:p>
+        </w:tc>
+        <w:tc>
+          <w:tcPr>
+            <w:tcW w:type="dxa" w:w="7937"/>
+          </w:tcPr>
+          <w:p>
+            <w:r/>
+            <w:r>
+              <w:rPr>
+                <w:rFonts w:ascii="Pretendard" w:hAnsi="Pretendard" w:eastAsia="Pretendard"/>
+                <w:b w:val="0"/>
+                <w:i w:val="0"/>
+                <w:color w:val="111111"/>
+                <w:sz w:val="18"/>
+              </w:rPr>
+              <w:t>Studio shot of three small glass jars of smooth fruit puree — apple, apricot, quince — with black lids, pure white seamless background, no cast shadow, no glow, isolated cut-out style. Style: editorial food &amp; origin photography, photorealistic, natural warm light, muted palette of ivory, soil brown, pomegranate burgundy, apricot orange and leaf green with subtle gold accents, shallow depth of field, 35mm lens, premium brand-site quality, no text, no logos, no watermark. Aspect ratio 1:1. Avoid: text, letters, logo, watermark, cartoon, illustration, oversaturated, HDR, plastic look, extra fingers, deformed fruit, cluttered background.</w:t>
             </w:r>
           </w:p>
         </w:tc>
@@ -9179,6 +11037,45 @@
                 <w:color w:val="111111"/>
                 <w:sz w:val="18"/>
               </w:rPr>
+              <w:t>Nano Banana / Flux</w:t>
+            </w:r>
+          </w:p>
+        </w:tc>
+        <w:tc>
+          <w:tcPr>
+            <w:tcW w:type="dxa" w:w="7937"/>
+          </w:tcPr>
+          <w:p>
+            <w:r/>
+            <w:r>
+              <w:rPr>
+                <w:rFonts w:ascii="Pretendard" w:hAnsi="Pretendard" w:eastAsia="Pretendard"/>
+                <w:b w:val="0"/>
+                <w:i w:val="0"/>
+                <w:color w:val="111111"/>
+                <w:sz w:val="18"/>
+              </w:rPr>
+              <w:t>Close-up of freeze-dried pomegranate peel powder in a glass dish beside dried peel pieces on dark slate, warm side light. Style: editorial food &amp; origin photography, photorealistic, natural warm light, muted palette of ivory, soil brown, pomegranate burgundy, apricot orange and leaf green with subtle gold accents, shallow depth of field, 35mm lens, premium brand-site quality, no text, no logos, no watermark. Aspect ratio 16:10. Avoid: text, letters, logo, watermark, cartoon, illustration, oversaturated, HDR, plastic look, extra fingers, deformed fruit, cluttered background.</w:t>
+            </w:r>
+          </w:p>
+        </w:tc>
+      </w:tr>
+      <w:tr>
+        <w:tc>
+          <w:tcPr>
+            <w:tcW w:type="dxa" w:w="1701"/>
+            <w:shd w:val="clear" w:color="auto" w:fill="F3EAD3"/>
+          </w:tcPr>
+          <w:p>
+            <w:r/>
+            <w:r>
+              <w:rPr>
+                <w:rFonts w:ascii="Pretendard" w:hAnsi="Pretendard" w:eastAsia="Pretendard"/>
+                <w:b/>
+                <w:i w:val="0"/>
+                <w:color w:val="111111"/>
+                <w:sz w:val="18"/>
+              </w:rPr>
               <w:t>네거티브</w:t>
             </w:r>
           </w:p>
@@ -9486,6 +11383,45 @@
                 <w:color w:val="111111"/>
                 <w:sz w:val="18"/>
               </w:rPr>
+              <w:t>Nano Banana / Flux</w:t>
+            </w:r>
+          </w:p>
+        </w:tc>
+        <w:tc>
+          <w:tcPr>
+            <w:tcW w:type="dxa" w:w="7937"/>
+          </w:tcPr>
+          <w:p>
+            <w:r/>
+            <w:r>
+              <w:rPr>
+                <w:rFonts w:ascii="Pretendard" w:hAnsi="Pretendard" w:eastAsia="Pretendard"/>
+                <w:b w:val="0"/>
+                <w:i w:val="0"/>
+                <w:color w:val="111111"/>
+                <w:sz w:val="18"/>
+              </w:rPr>
+              <w:t>Minimal still life of a brass company seal, a document folder and a small pomegranate on an ivory desk, soft light, understated corporate elegance. Style: editorial food &amp; origin photography, photorealistic, natural warm light, muted palette of ivory, soil brown, pomegranate burgundy, apricot orange and leaf green with subtle gold accents, shallow depth of field, 35mm lens, premium brand-site quality, no text, no logos, no watermark. Aspect ratio 16:10. Avoid: text, letters, logo, watermark, cartoon, illustration, oversaturated, HDR, plastic look, extra fingers, deformed fruit, cluttered background.</w:t>
+            </w:r>
+          </w:p>
+        </w:tc>
+      </w:tr>
+      <w:tr>
+        <w:tc>
+          <w:tcPr>
+            <w:tcW w:type="dxa" w:w="1701"/>
+            <w:shd w:val="clear" w:color="auto" w:fill="F3EAD3"/>
+          </w:tcPr>
+          <w:p>
+            <w:r/>
+            <w:r>
+              <w:rPr>
+                <w:rFonts w:ascii="Pretendard" w:hAnsi="Pretendard" w:eastAsia="Pretendard"/>
+                <w:b/>
+                <w:i w:val="0"/>
+                <w:color w:val="111111"/>
+                <w:sz w:val="18"/>
+              </w:rPr>
               <w:t>네거티브</w:t>
             </w:r>
           </w:p>
@@ -9793,6 +11729,45 @@
                 <w:color w:val="111111"/>
                 <w:sz w:val="18"/>
               </w:rPr>
+              <w:t>Nano Banana / Flux</w:t>
+            </w:r>
+          </w:p>
+        </w:tc>
+        <w:tc>
+          <w:tcPr>
+            <w:tcW w:type="dxa" w:w="7937"/>
+          </w:tcPr>
+          <w:p>
+            <w:r/>
+            <w:r>
+              <w:rPr>
+                <w:rFonts w:ascii="Pretendard" w:hAnsi="Pretendard" w:eastAsia="Pretendard"/>
+                <w:b w:val="0"/>
+                <w:i w:val="0"/>
+                <w:color w:val="111111"/>
+                <w:sz w:val="18"/>
+              </w:rPr>
+              <w:t>Overhead shot of a printed premium food catalog open on dark slate, a jam jar and a juice bottle beside it, warm gold accent light. Style: editorial food &amp; origin photography, photorealistic, natural warm light, muted palette of ivory, soil brown, pomegranate burgundy, apricot orange and leaf green with subtle gold accents, shallow depth of field, 35mm lens, premium brand-site quality, no text, no logos, no watermark. Aspect ratio 16:10. Avoid: text, letters, logo, watermark, cartoon, illustration, oversaturated, HDR, plastic look, extra fingers, deformed fruit, cluttered background.</w:t>
+            </w:r>
+          </w:p>
+        </w:tc>
+      </w:tr>
+      <w:tr>
+        <w:tc>
+          <w:tcPr>
+            <w:tcW w:type="dxa" w:w="1701"/>
+            <w:shd w:val="clear" w:color="auto" w:fill="F3EAD3"/>
+          </w:tcPr>
+          <w:p>
+            <w:r/>
+            <w:r>
+              <w:rPr>
+                <w:rFonts w:ascii="Pretendard" w:hAnsi="Pretendard" w:eastAsia="Pretendard"/>
+                <w:b/>
+                <w:i w:val="0"/>
+                <w:color w:val="111111"/>
+                <w:sz w:val="18"/>
+              </w:rPr>
               <w:t>네거티브</w:t>
             </w:r>
           </w:p>
@@ -10405,6 +12380,230 @@
                 <w:sz w:val="17"/>
               </w:rPr>
               <w:t>Black Forest Labs의 이미지 생성 모델. 자연어 긴 프롬프트에 강함</w:t>
+            </w:r>
+          </w:p>
+        </w:tc>
+      </w:tr>
+      <w:tr>
+        <w:tc>
+          <w:tcPr>
+            <w:tcW w:type="dxa" w:w="3324"/>
+          </w:tcPr>
+          <w:p>
+            <w:r/>
+            <w:r>
+              <w:rPr>
+                <w:rFonts w:ascii="Pretendard" w:hAnsi="Pretendard" w:eastAsia="Pretendard"/>
+                <w:b/>
+                <w:i w:val="0"/>
+                <w:color w:val="111111"/>
+                <w:sz w:val="17"/>
+              </w:rPr>
+              <w:t>스포트라이트 스테이지</w:t>
+            </w:r>
+          </w:p>
+        </w:tc>
+        <w:tc>
+          <w:tcPr>
+            <w:tcW w:type="dxa" w:w="3324"/>
+          </w:tcPr>
+          <w:p>
+            <w:r/>
+            <w:r>
+              <w:rPr>
+                <w:rFonts w:ascii="Pretendard" w:hAnsi="Pretendard" w:eastAsia="Pretendard"/>
+                <w:b w:val="0"/>
+                <w:i w:val="0"/>
+                <w:color w:val="111111"/>
+                <w:sz w:val="17"/>
+              </w:rPr>
+              <w:t>Product Stage</w:t>
+            </w:r>
+          </w:p>
+        </w:tc>
+        <w:tc>
+          <w:tcPr>
+            <w:tcW w:type="dxa" w:w="3324"/>
+          </w:tcPr>
+          <w:p>
+            <w:r/>
+            <w:r>
+              <w:rPr>
+                <w:rFonts w:ascii="Pretendard" w:hAnsi="Pretendard" w:eastAsia="Pretendard"/>
+                <w:b w:val="0"/>
+                <w:i w:val="0"/>
+                <w:color w:val="111111"/>
+                <w:sz w:val="17"/>
+              </w:rPr>
+              <w:t>사이트가 모든 제품 카드에 공통으로 입히는 위쪽 빛줄기·원형 후광·바닥 반사 효과</w:t>
+            </w:r>
+          </w:p>
+        </w:tc>
+      </w:tr>
+      <w:tr>
+        <w:tc>
+          <w:tcPr>
+            <w:tcW w:type="dxa" w:w="3324"/>
+          </w:tcPr>
+          <w:p>
+            <w:r/>
+            <w:r>
+              <w:rPr>
+                <w:rFonts w:ascii="Pretendard" w:hAnsi="Pretendard" w:eastAsia="Pretendard"/>
+                <w:b/>
+                <w:i w:val="0"/>
+                <w:color w:val="111111"/>
+                <w:sz w:val="17"/>
+              </w:rPr>
+              <w:t>후광</w:t>
+            </w:r>
+          </w:p>
+        </w:tc>
+        <w:tc>
+          <w:tcPr>
+            <w:tcW w:type="dxa" w:w="3324"/>
+          </w:tcPr>
+          <w:p>
+            <w:r/>
+            <w:r>
+              <w:rPr>
+                <w:rFonts w:ascii="Pretendard" w:hAnsi="Pretendard" w:eastAsia="Pretendard"/>
+                <w:b w:val="0"/>
+                <w:i w:val="0"/>
+                <w:color w:val="111111"/>
+                <w:sz w:val="17"/>
+              </w:rPr>
+              <w:t>Halo / Glow</w:t>
+            </w:r>
+          </w:p>
+        </w:tc>
+        <w:tc>
+          <w:tcPr>
+            <w:tcW w:type="dxa" w:w="3324"/>
+          </w:tcPr>
+          <w:p>
+            <w:r/>
+            <w:r>
+              <w:rPr>
+                <w:rFonts w:ascii="Pretendard" w:hAnsi="Pretendard" w:eastAsia="Pretendard"/>
+                <w:b w:val="0"/>
+                <w:i w:val="0"/>
+                <w:color w:val="111111"/>
+                <w:sz w:val="17"/>
+              </w:rPr>
+              <w:t>피사체 뒤 번진 빛. 제품 이미지에 미리 들어 있으면 사이트 조명과 겹쳐 어색해짐</w:t>
+            </w:r>
+          </w:p>
+        </w:tc>
+      </w:tr>
+      <w:tr>
+        <w:tc>
+          <w:tcPr>
+            <w:tcW w:type="dxa" w:w="3324"/>
+          </w:tcPr>
+          <w:p>
+            <w:r/>
+            <w:r>
+              <w:rPr>
+                <w:rFonts w:ascii="Pretendard" w:hAnsi="Pretendard" w:eastAsia="Pretendard"/>
+                <w:b/>
+                <w:i w:val="0"/>
+                <w:color w:val="111111"/>
+                <w:sz w:val="17"/>
+              </w:rPr>
+              <w:t>i18n</w:t>
+            </w:r>
+          </w:p>
+        </w:tc>
+        <w:tc>
+          <w:tcPr>
+            <w:tcW w:type="dxa" w:w="3324"/>
+          </w:tcPr>
+          <w:p>
+            <w:r/>
+            <w:r>
+              <w:rPr>
+                <w:rFonts w:ascii="Pretendard" w:hAnsi="Pretendard" w:eastAsia="Pretendard"/>
+                <w:b w:val="0"/>
+                <w:i w:val="0"/>
+                <w:color w:val="111111"/>
+                <w:sz w:val="17"/>
+              </w:rPr>
+              <w:t>Internationalization (국제화)</w:t>
+            </w:r>
+          </w:p>
+        </w:tc>
+        <w:tc>
+          <w:tcPr>
+            <w:tcW w:type="dxa" w:w="3324"/>
+          </w:tcPr>
+          <w:p>
+            <w:r/>
+            <w:r>
+              <w:rPr>
+                <w:rFonts w:ascii="Pretendard" w:hAnsi="Pretendard" w:eastAsia="Pretendard"/>
+                <w:b w:val="0"/>
+                <w:i w:val="0"/>
+                <w:color w:val="111111"/>
+                <w:sz w:val="17"/>
+              </w:rPr>
+              <w:t>사이트를 여러 언어로 운영하는 구조. 현재 KO·EN·JA·ZH</w:t>
+            </w:r>
+          </w:p>
+        </w:tc>
+      </w:tr>
+      <w:tr>
+        <w:tc>
+          <w:tcPr>
+            <w:tcW w:type="dxa" w:w="3324"/>
+          </w:tcPr>
+          <w:p>
+            <w:r/>
+            <w:r>
+              <w:rPr>
+                <w:rFonts w:ascii="Pretendard" w:hAnsi="Pretendard" w:eastAsia="Pretendard"/>
+                <w:b/>
+                <w:i w:val="0"/>
+                <w:color w:val="111111"/>
+                <w:sz w:val="17"/>
+              </w:rPr>
+              <w:t>HEX</w:t>
+            </w:r>
+          </w:p>
+        </w:tc>
+        <w:tc>
+          <w:tcPr>
+            <w:tcW w:type="dxa" w:w="3324"/>
+          </w:tcPr>
+          <w:p>
+            <w:r/>
+            <w:r>
+              <w:rPr>
+                <w:rFonts w:ascii="Pretendard" w:hAnsi="Pretendard" w:eastAsia="Pretendard"/>
+                <w:b w:val="0"/>
+                <w:i w:val="0"/>
+                <w:color w:val="111111"/>
+                <w:sz w:val="17"/>
+              </w:rPr>
+              <w:t>Hexadecimal color code</w:t>
+            </w:r>
+          </w:p>
+        </w:tc>
+        <w:tc>
+          <w:tcPr>
+            <w:tcW w:type="dxa" w:w="3324"/>
+          </w:tcPr>
+          <w:p>
+            <w:r/>
+            <w:r>
+              <w:rPr>
+                <w:rFonts w:ascii="Pretendard" w:hAnsi="Pretendard" w:eastAsia="Pretendard"/>
+                <w:b w:val="0"/>
+                <w:i w:val="0"/>
+                <w:color w:val="111111"/>
+                <w:sz w:val="17"/>
+              </w:rPr>
+              <w:t>#B49141(골드)·#111111(차콜)처럼 색을 16진수로 표기한 값</w:t>
             </w:r>
           </w:p>
         </w:tc>

</xml_diff>